<commit_message>
Polish Word ID card template
Add blue header band with white text, faded logo watermark behind the
card, bordered photo frame, underlined fill-in fields, validity and
signature strip, footer band and top/bottom accent bars. Same
light-blue color scheme.

https://claude.ai/code/session_01VeE5pevma4QUbkZrBAwbXG
</commit_message>
<xml_diff>
--- a/TFC-ID-Card-Template.docx
+++ b/TFC-ID-Card-Template.docx
@@ -12,9 +12,10 @@
           <w:b/>
           <w:i w:val="0"/>
           <w:color w:val="0C4A6E"/>
-          <w:sz w:val="28"/>
+          <w:sz w:val="30"/>
+          <w:spacing w:val="30"/>
         </w:rPr>
-        <w:t>TFC SCHOOL — IDENTITY CARD TEMPLATE</w:t>
+        <w:t>OFFICIAL IDENTITY CARD</w:t>
       </w:r>
     </w:p>
     <w:p>
@@ -29,10 +30,14 @@
           <w:color w:val="0369A1"/>
           <w:sz w:val="18"/>
         </w:rPr>
-        <w:t>Editable template · fill in the blank fields below</w:t>
+        <w:t>Training Formation Center  ·  editable template</w:t>
       </w:r>
     </w:p>
-    <w:p/>
+    <w:p>
+      <w:pPr>
+        <w:spacing w:after="40"/>
+      </w:pPr>
+    </w:p>
     <w:tbl>
       <w:tblPr>
         <w:tblW w:type="auto" w:w="0"/>
@@ -41,21 +46,26 @@
         <w:tblLook w:firstColumn="1" w:firstRow="1" w:lastColumn="0" w:lastRow="0" w:noHBand="0" w:noVBand="1" w:val="04A0"/>
       </w:tblPr>
       <w:tblGrid>
-        <w:gridCol w:w="9360"/>
+        <w:gridCol w:w="9648"/>
       </w:tblGrid>
       <w:tr>
         <w:tc>
           <w:tcPr>
-            <w:tcW w:type="dxa" w:w="7200"/>
-            <w:shd w:val="clear" w:color="auto" w:fill="EFF6FF"/>
+            <w:tcW w:type="dxa" w:w="7488"/>
+            <w:shd w:val="clear" w:color="auto" w:fill="FFFFFF"/>
             <w:tcBorders>
-              <w:top w:val="single" w:sz="18" w:space="0" w:color="0EA5E9"/>
-              <w:left w:val="single" w:sz="18" w:space="0" w:color="0EA5E9"/>
-              <w:bottom w:val="single" w:sz="18" w:space="0" w:color="0EA5E9"/>
-              <w:right w:val="single" w:sz="18" w:space="0" w:color="0EA5E9"/>
+              <w:top w:val="single" w:sz="20" w:space="0" w:color="0EA5E9"/>
+              <w:left w:val="single" w:sz="20" w:space="0" w:color="0EA5E9"/>
+              <w:bottom w:val="single" w:sz="20" w:space="0" w:color="0EA5E9"/>
+              <w:right w:val="single" w:sz="20" w:space="0" w:color="0EA5E9"/>
             </w:tcBorders>
+            <w:tcMar>
+              <w:top w:w="0" w:type="dxa"/>
+              <w:bottom w:w="0" w:type="dxa"/>
+              <w:start w:w="0" w:type="dxa"/>
+              <w:end w:w="0" w:type="dxa"/>
+            </w:tcMar>
           </w:tcPr>
-          <w:p/>
           <w:tbl>
             <w:tblPr>
               <w:tblW w:type="auto" w:w="0"/>
@@ -63,24 +73,30 @@
               <w:tblLook w:firstColumn="1" w:firstRow="1" w:lastColumn="0" w:lastRow="0" w:noHBand="0" w:noVBand="1" w:val="04A0"/>
             </w:tblPr>
             <w:tblGrid>
-              <w:gridCol w:w="7200"/>
+              <w:gridCol w:w="7488"/>
             </w:tblGrid>
             <w:tr>
               <w:tc>
                 <w:tcPr>
-                  <w:tcW w:type="dxa" w:w="7200"/>
+                  <w:tcW w:type="dxa" w:w="7488"/>
                   <w:shd w:val="clear" w:color="auto" w:fill="0EA5E9"/>
+                  <w:tcMar>
+                    <w:top w:w="0" w:type="dxa"/>
+                    <w:bottom w:w="0" w:type="dxa"/>
+                    <w:start w:w="0" w:type="dxa"/>
+                    <w:end w:w="0" w:type="dxa"/>
+                  </w:tcMar>
                 </w:tcPr>
                 <w:p>
                   <w:pPr>
-                    <w:spacing w:before="0" w:after="40"/>
+                    <w:spacing w:before="0" w:after="0" w:line="240" w:lineRule="auto"/>
                   </w:pPr>
                   <w:r>
                     <w:rPr>
                       <w:rFonts w:ascii="Calibri" w:hAnsi="Calibri"/>
                       <w:b w:val="0"/>
                       <w:i w:val="0"/>
-                      <w:sz w:val="8"/>
+                      <w:sz w:val="10"/>
                     </w:rPr>
                     <w:t xml:space="preserve"> </w:t>
                   </w:r>
@@ -96,24 +112,32 @@
               <w:tblLook w:firstColumn="1" w:firstRow="1" w:lastColumn="0" w:lastRow="0" w:noHBand="0" w:noVBand="1" w:val="04A0"/>
             </w:tblPr>
             <w:tblGrid>
-              <w:gridCol w:w="2400"/>
-              <w:gridCol w:w="2400"/>
-              <w:gridCol w:w="2400"/>
+              <w:gridCol w:w="2496"/>
+              <w:gridCol w:w="2496"/>
+              <w:gridCol w:w="2496"/>
             </w:tblGrid>
             <w:tr>
               <w:tc>
                 <w:tcPr>
-                  <w:tcW w:type="dxa" w:w="1296"/>
+                  <w:tcW w:type="dxa" w:w="1440"/>
+                  <w:shd w:val="clear" w:color="auto" w:fill="2563EB"/>
+                  <w:vAlign w:val="center"/>
+                  <w:tcMar>
+                    <w:top w:w="120" w:type="dxa"/>
+                    <w:bottom w:w="120" w:type="dxa"/>
+                    <w:start w:w="140" w:type="dxa"/>
+                    <w:end w:w="140" w:type="dxa"/>
+                  </w:tcMar>
                 </w:tcPr>
                 <w:p>
                   <w:pPr>
-                    <w:spacing w:before="0" w:after="40"/>
+                    <w:spacing w:before="0" w:after="40" w:line="240" w:lineRule="auto"/>
                     <w:jc w:val="center"/>
                   </w:pPr>
                   <w:r>
                     <w:drawing>
                       <wp:inline xmlns:a="http://schemas.openxmlformats.org/drawingml/2006/main" xmlns:pic="http://schemas.openxmlformats.org/drawingml/2006/picture">
-                        <wp:extent cx="594360" cy="596933"/>
+                        <wp:extent cx="640080" cy="642851"/>
                         <wp:docPr id="1" name="Picture 1"/>
                         <wp:cNvGraphicFramePr>
                           <a:graphicFrameLocks noChangeAspect="1"/>
@@ -126,7 +150,7 @@
                                 <pic:cNvPicPr/>
                               </pic:nvPicPr>
                               <pic:blipFill>
-                                <a:blip r:embed="rId9"/>
+                                <a:blip r:embed="rId10"/>
                                 <a:stretch>
                                   <a:fillRect/>
                                 </a:stretch>
@@ -134,7 +158,7 @@
                               <pic:spPr>
                                 <a:xfrm>
                                   <a:off x="0" y="0"/>
-                                  <a:ext cx="594360" cy="596933"/>
+                                  <a:ext cx="640080" cy="642851"/>
                                 </a:xfrm>
                                 <a:prstGeom prst="rect"/>
                               </pic:spPr>
@@ -149,45 +173,61 @@
               <w:tc>
                 <w:tcPr>
                   <w:tcW w:type="dxa" w:w="3888"/>
+                  <w:shd w:val="clear" w:color="auto" w:fill="2563EB"/>
+                  <w:vAlign w:val="center"/>
+                  <w:tcMar>
+                    <w:top w:w="120" w:type="dxa"/>
+                    <w:bottom w:w="120" w:type="dxa"/>
+                    <w:start w:w="140" w:type="dxa"/>
+                    <w:end w:w="140" w:type="dxa"/>
+                  </w:tcMar>
                 </w:tcPr>
                 <w:p>
                   <w:pPr>
-                    <w:spacing w:before="0" w:after="40"/>
+                    <w:spacing w:before="0" w:after="40" w:line="240" w:lineRule="auto"/>
                   </w:pPr>
                   <w:r>
                     <w:rPr>
                       <w:rFonts w:ascii="Calibri" w:hAnsi="Calibri"/>
                       <w:b/>
                       <w:i w:val="0"/>
-                      <w:color w:val="0C4A6E"/>
+                      <w:color w:val="FFFFFF"/>
                       <w:sz w:val="24"/>
                     </w:rPr>
-                    <w:t>Training Formation Center</w:t>
+                    <w:t>TRAINING FORMATION CENTER</w:t>
                   </w:r>
                 </w:p>
                 <w:p>
                   <w:pPr>
-                    <w:spacing w:before="0" w:after="40"/>
+                    <w:spacing w:before="0" w:after="40" w:line="240" w:lineRule="auto"/>
                   </w:pPr>
                   <w:r>
                     <w:rPr>
                       <w:rFonts w:ascii="Calibri" w:hAnsi="Calibri"/>
-                      <w:b/>
-                      <w:i w:val="0"/>
-                      <w:color w:val="0369A1"/>
-                      <w:sz w:val="15"/>
+                      <w:b w:val="0"/>
+                      <w:i/>
+                      <w:color w:val="DBEAFE"/>
+                      <w:sz w:val="16"/>
                     </w:rPr>
-                    <w:t>STUDENT / STAFF IDENTITY CARD</w:t>
+                    <w:t>Student / Staff Identity Card</w:t>
                   </w:r>
                 </w:p>
               </w:tc>
               <w:tc>
                 <w:tcPr>
-                  <w:tcW w:type="dxa" w:w="2016"/>
+                  <w:tcW w:type="dxa" w:w="2160"/>
+                  <w:shd w:val="clear" w:color="auto" w:fill="2563EB"/>
+                  <w:vAlign w:val="center"/>
+                  <w:tcMar>
+                    <w:top w:w="120" w:type="dxa"/>
+                    <w:bottom w:w="120" w:type="dxa"/>
+                    <w:start w:w="140" w:type="dxa"/>
+                    <w:end w:w="140" w:type="dxa"/>
+                  </w:tcMar>
                 </w:tcPr>
                 <w:p>
                   <w:pPr>
-                    <w:spacing w:before="0" w:after="40"/>
+                    <w:spacing w:before="0" w:after="40" w:line="240" w:lineRule="auto"/>
                     <w:jc w:val="right"/>
                   </w:pPr>
                   <w:r>
@@ -195,15 +235,17 @@
                       <w:rFonts w:ascii="Calibri" w:hAnsi="Calibri"/>
                       <w:b/>
                       <w:i w:val="0"/>
-                      <w:color w:val="0369A1"/>
-                      <w:sz w:val="14"/>
+                      <w:color w:val="BFDBFE"/>
+                      <w:sz w:val="15"/>
+                      <w:caps w:val="true"/>
+                      <w:spacing w:val="20"/>
                     </w:rPr>
-                    <w:t>OFFICIAL ID</w:t>
+                    <w:t>ID No.</w:t>
                   </w:r>
                 </w:p>
                 <w:p>
                   <w:pPr>
-                    <w:spacing w:before="0" w:after="40"/>
+                    <w:spacing w:before="0" w:after="40" w:line="240" w:lineRule="auto"/>
                     <w:jc w:val="right"/>
                   </w:pPr>
                   <w:r>
@@ -211,8 +253,8 @@
                       <w:rFonts w:ascii="Calibri" w:hAnsi="Calibri"/>
                       <w:b/>
                       <w:i w:val="0"/>
-                      <w:color w:val="0C4A6E"/>
-                      <w:sz w:val="22"/>
+                      <w:color w:val="FFFFFF"/>
+                      <w:sz w:val="24"/>
                     </w:rPr>
                     <w:t>TFC-______</w:t>
                   </w:r>
@@ -228,68 +270,104 @@
               <w:tblLook w:firstColumn="1" w:firstRow="1" w:lastColumn="0" w:lastRow="0" w:noHBand="0" w:noVBand="1" w:val="04A0"/>
             </w:tblPr>
             <w:tblGrid>
-              <w:gridCol w:w="3600"/>
-              <w:gridCol w:w="3600"/>
+              <w:gridCol w:w="3744"/>
+              <w:gridCol w:w="3744"/>
             </w:tblGrid>
             <w:tr>
               <w:tc>
                 <w:tcPr>
-                  <w:tcW w:type="dxa" w:w="2160"/>
+                  <w:tcW w:type="dxa" w:w="2304"/>
+                  <w:shd w:val="clear" w:color="auto" w:fill="F0F9FF"/>
+                  <w:vAlign w:val="center"/>
+                  <w:tcMar>
+                    <w:top w:w="160" w:type="dxa"/>
+                    <w:bottom w:w="160" w:type="dxa"/>
+                    <w:start w:w="140" w:type="dxa"/>
+                    <w:end w:w="140" w:type="dxa"/>
+                  </w:tcMar>
+                </w:tcPr>
+                <w:p/>
+                <w:tbl>
+                  <w:tblPr>
+                    <w:tblW w:type="auto" w:w="0"/>
+                    <w:tblLayout w:type="fixed"/>
+                    <w:tblLook w:firstColumn="1" w:firstRow="1" w:lastColumn="0" w:lastRow="0" w:noHBand="0" w:noVBand="1" w:val="04A0"/>
+                  </w:tblPr>
+                  <w:tblGrid>
+                    <w:gridCol w:w="2304"/>
+                  </w:tblGrid>
+                  <w:tr>
+                    <w:tc>
+                      <w:tcPr>
+                        <w:tcW w:type="dxa" w:w="1800"/>
+                        <w:shd w:val="clear" w:color="auto" w:fill="FFFFFF"/>
+                        <w:tcBorders>
+                          <w:top w:val="single" w:sz="14" w:space="0" w:color="38BDF8"/>
+                          <w:left w:val="single" w:sz="14" w:space="0" w:color="38BDF8"/>
+                          <w:bottom w:val="single" w:sz="14" w:space="0" w:color="38BDF8"/>
+                          <w:right w:val="single" w:sz="14" w:space="0" w:color="38BDF8"/>
+                        </w:tcBorders>
+                        <w:tcMar>
+                          <w:top w:w="420" w:type="dxa"/>
+                          <w:bottom w:w="420" w:type="dxa"/>
+                          <w:start w:w="60" w:type="dxa"/>
+                          <w:end w:w="60" w:type="dxa"/>
+                        </w:tcMar>
+                        <w:vAlign w:val="center"/>
+                      </w:tcPr>
+                      <w:p>
+                        <w:pPr>
+                          <w:spacing w:before="0" w:after="40" w:line="240" w:lineRule="auto"/>
+                          <w:jc w:val="center"/>
+                        </w:pPr>
+                        <w:r>
+                          <w:rPr>
+                            <w:rFonts w:ascii="Calibri" w:hAnsi="Calibri"/>
+                            <w:b/>
+                            <w:i w:val="0"/>
+                            <w:color w:val="0EA5E9"/>
+                            <w:sz w:val="22"/>
+                            <w:caps w:val="true"/>
+                            <w:spacing w:val="20"/>
+                          </w:rPr>
+                          <w:t>PHOTO</w:t>
+                        </w:r>
+                      </w:p>
+                      <w:p>
+                        <w:pPr>
+                          <w:spacing w:before="0" w:after="40" w:line="240" w:lineRule="auto"/>
+                          <w:jc w:val="center"/>
+                        </w:pPr>
+                        <w:r>
+                          <w:rPr>
+                            <w:rFonts w:ascii="Calibri" w:hAnsi="Calibri"/>
+                            <w:b w:val="0"/>
+                            <w:i/>
+                            <w:color w:val="0369A1"/>
+                            <w:sz w:val="16"/>
+                          </w:rPr>
+                          <w:t>paste here</w:t>
+                        </w:r>
+                      </w:p>
+                    </w:tc>
+                  </w:tr>
+                </w:tbl>
+                <w:p/>
+              </w:tc>
+              <w:tc>
+                <w:tcPr>
+                  <w:tcW w:type="dxa" w:w="5184"/>
                   <w:shd w:val="clear" w:color="auto" w:fill="FFFFFF"/>
-                  <w:tcBorders>
-                    <w:top w:val="single" w:sz="12" w:space="0" w:color="38BDF8"/>
-                    <w:left w:val="single" w:sz="12" w:space="0" w:color="38BDF8"/>
-                    <w:bottom w:val="single" w:sz="12" w:space="0" w:color="38BDF8"/>
-                    <w:right w:val="single" w:sz="12" w:space="0" w:color="38BDF8"/>
-                  </w:tcBorders>
+                  <w:tcMar>
+                    <w:top w:w="160" w:type="dxa"/>
+                    <w:bottom w:w="160" w:type="dxa"/>
+                    <w:start w:w="200" w:type="dxa"/>
+                    <w:end w:w="160" w:type="dxa"/>
+                  </w:tcMar>
                 </w:tcPr>
                 <w:p>
                   <w:pPr>
-                    <w:spacing w:before="0" w:after="40"/>
-                    <w:jc w:val="center"/>
-                  </w:pPr>
-                  <w:r>
-                    <w:rPr>
-                      <w:rFonts w:ascii="Calibri" w:hAnsi="Calibri"/>
-                      <w:b w:val="0"/>
-                      <w:i w:val="0"/>
-                      <w:sz w:val="20"/>
-                    </w:rPr>
-                    <w:br/>
-                    <w:br/>
-                  </w:r>
-                  <w:r>
-                    <w:rPr>
-                      <w:rFonts w:ascii="Calibri" w:hAnsi="Calibri"/>
-                      <w:b/>
-                      <w:i w:val="0"/>
-                      <w:color w:val="0EA5E9"/>
-                      <w:sz w:val="22"/>
-                    </w:rPr>
-                    <w:t>PHOTO</w:t>
-                  </w:r>
-                  <w:r>
-                    <w:rPr>
-                      <w:rFonts w:ascii="Calibri" w:hAnsi="Calibri"/>
-                      <w:b w:val="0"/>
-                      <w:i/>
-                      <w:color w:val="0369A1"/>
-                      <w:sz w:val="16"/>
-                    </w:rPr>
-                    <w:br/>
-                    <w:t>(paste here)</w:t>
-                    <w:br/>
-                    <w:br/>
-                  </w:r>
-                </w:p>
-              </w:tc>
-              <w:tc>
-                <w:tcPr>
-                  <w:tcW w:type="dxa" w:w="5040"/>
-                </w:tcPr>
-                <w:p>
-                  <w:pPr>
-                    <w:spacing w:before="0" w:after="40"/>
+                    <w:spacing w:before="0" w:after="0" w:line="240" w:lineRule="auto"/>
                   </w:pPr>
                   <w:r>
                     <w:rPr>
@@ -297,19 +375,94 @@
                       <w:b/>
                       <w:i w:val="0"/>
                       <w:color w:val="0369A1"/>
-                      <w:sz w:val="16"/>
+                      <w:sz w:val="15"/>
+                      <w:caps w:val="true"/>
+                      <w:spacing w:val="20"/>
                     </w:rPr>
                     <w:t>Full name</w:t>
                   </w:r>
                 </w:p>
                 <w:p>
                   <w:pPr>
-                    <w:spacing w:before="0" w:after="40"/>
+                    <w:spacing w:before="0" w:after="120" w:line="240" w:lineRule="auto"/>
+                    <w:pBdr>
+                      <w:bottom w:val="single" w:sz="4" w:space="2" w:color="BAE6FD"/>
+                    </w:pBdr>
                   </w:pPr>
                   <w:r>
                     <w:rPr>
                       <w:rFonts w:ascii="Calibri" w:hAnsi="Calibri"/>
                       <w:b/>
+                      <w:i w:val="0"/>
+                      <w:color w:val="0C4A6E"/>
+                      <w:sz w:val="26"/>
+                    </w:rPr>
+                    <w:t>______________________________</w:t>
+                  </w:r>
+                </w:p>
+                <w:p>
+                  <w:pPr>
+                    <w:spacing w:before="0" w:after="0" w:line="240" w:lineRule="auto"/>
+                  </w:pPr>
+                  <w:r>
+                    <w:rPr>
+                      <w:rFonts w:ascii="Calibri" w:hAnsi="Calibri"/>
+                      <w:b/>
+                      <w:i w:val="0"/>
+                      <w:color w:val="0369A1"/>
+                      <w:sz w:val="15"/>
+                      <w:caps w:val="true"/>
+                      <w:spacing w:val="20"/>
+                    </w:rPr>
+                    <w:t>Date of birth</w:t>
+                  </w:r>
+                </w:p>
+                <w:p>
+                  <w:pPr>
+                    <w:spacing w:before="0" w:after="120" w:line="240" w:lineRule="auto"/>
+                    <w:pBdr>
+                      <w:bottom w:val="single" w:sz="4" w:space="2" w:color="BAE6FD"/>
+                    </w:pBdr>
+                  </w:pPr>
+                  <w:r>
+                    <w:rPr>
+                      <w:rFonts w:ascii="Calibri" w:hAnsi="Calibri"/>
+                      <w:b w:val="0"/>
+                      <w:i w:val="0"/>
+                      <w:color w:val="0C4A6E"/>
+                      <w:sz w:val="22"/>
+                    </w:rPr>
+                    <w:t>____ / ____ / __________</w:t>
+                  </w:r>
+                </w:p>
+                <w:p>
+                  <w:pPr>
+                    <w:spacing w:before="0" w:after="0" w:line="240" w:lineRule="auto"/>
+                  </w:pPr>
+                  <w:r>
+                    <w:rPr>
+                      <w:rFonts w:ascii="Calibri" w:hAnsi="Calibri"/>
+                      <w:b/>
+                      <w:i w:val="0"/>
+                      <w:color w:val="0369A1"/>
+                      <w:sz w:val="15"/>
+                      <w:caps w:val="true"/>
+                      <w:spacing w:val="20"/>
+                    </w:rPr>
+                    <w:t>Course / Subject</w:t>
+                  </w:r>
+                </w:p>
+                <w:p>
+                  <w:pPr>
+                    <w:spacing w:before="0" w:after="120" w:line="240" w:lineRule="auto"/>
+                    <w:pBdr>
+                      <w:bottom w:val="single" w:sz="4" w:space="2" w:color="BAE6FD"/>
+                    </w:pBdr>
+                  </w:pPr>
+                  <w:r>
+                    <w:rPr>
+                      <w:rFonts w:ascii="Calibri" w:hAnsi="Calibri"/>
+                      <w:b w:val="0"/>
                       <w:i w:val="0"/>
                       <w:color w:val="0C4A6E"/>
                       <w:sz w:val="22"/>
@@ -319,7 +472,7 @@
                 </w:p>
                 <w:p>
                   <w:pPr>
-                    <w:spacing w:before="0" w:after="40"/>
+                    <w:spacing w:before="0" w:after="0" w:line="240" w:lineRule="auto"/>
                   </w:pPr>
                   <w:r>
                     <w:rPr>
@@ -327,14 +480,19 @@
                       <w:b/>
                       <w:i w:val="0"/>
                       <w:color w:val="0369A1"/>
-                      <w:sz w:val="16"/>
+                      <w:sz w:val="15"/>
+                      <w:caps w:val="true"/>
+                      <w:spacing w:val="20"/>
                     </w:rPr>
-                    <w:t>Date of birth</w:t>
+                    <w:t>Card ID</w:t>
                   </w:r>
                 </w:p>
                 <w:p>
                   <w:pPr>
-                    <w:spacing w:before="0" w:after="40"/>
+                    <w:spacing w:before="0" w:after="120" w:line="240" w:lineRule="auto"/>
+                    <w:pBdr>
+                      <w:bottom w:val="single" w:sz="4" w:space="2" w:color="BAE6FD"/>
+                    </w:pBdr>
                   </w:pPr>
                   <w:r>
                     <w:rPr>
@@ -342,14 +500,14 @@
                       <w:b w:val="0"/>
                       <w:i w:val="0"/>
                       <w:color w:val="0C4A6E"/>
-                      <w:sz w:val="20"/>
+                      <w:sz w:val="22"/>
                     </w:rPr>
-                    <w:t>____ / ____ / __________</w:t>
+                    <w:t>TFC-_______________</w:t>
                   </w:r>
                 </w:p>
                 <w:p>
                   <w:pPr>
-                    <w:spacing w:before="0" w:after="40"/>
+                    <w:spacing w:before="0" w:after="0" w:line="240" w:lineRule="auto"/>
                   </w:pPr>
                   <w:r>
                     <w:rPr>
@@ -357,14 +515,19 @@
                       <w:b/>
                       <w:i w:val="0"/>
                       <w:color w:val="0369A1"/>
-                      <w:sz w:val="16"/>
+                      <w:sz w:val="15"/>
+                      <w:caps w:val="true"/>
+                      <w:spacing w:val="20"/>
                     </w:rPr>
-                    <w:t>Course / Subject</w:t>
+                    <w:t>RFID card</w:t>
                   </w:r>
                 </w:p>
                 <w:p>
                   <w:pPr>
-                    <w:spacing w:before="0" w:after="40"/>
+                    <w:spacing w:before="0" w:after="120" w:line="240" w:lineRule="auto"/>
+                    <w:pBdr>
+                      <w:bottom w:val="single" w:sz="4" w:space="2" w:color="BAE6FD"/>
+                    </w:pBdr>
                   </w:pPr>
                   <w:r>
                     <w:rPr>
@@ -372,67 +535,7 @@
                       <w:b w:val="0"/>
                       <w:i w:val="0"/>
                       <w:color w:val="0C4A6E"/>
-                      <w:sz w:val="20"/>
-                    </w:rPr>
-                    <w:t>______________________________</w:t>
-                  </w:r>
-                </w:p>
-                <w:p>
-                  <w:pPr>
-                    <w:spacing w:before="0" w:after="40"/>
-                  </w:pPr>
-                  <w:r>
-                    <w:rPr>
-                      <w:rFonts w:ascii="Calibri" w:hAnsi="Calibri"/>
-                      <w:b/>
-                      <w:i w:val="0"/>
-                      <w:color w:val="0369A1"/>
-                      <w:sz w:val="16"/>
-                    </w:rPr>
-                    <w:t>ID number</w:t>
-                  </w:r>
-                </w:p>
-                <w:p>
-                  <w:pPr>
-                    <w:spacing w:before="0" w:after="40"/>
-                  </w:pPr>
-                  <w:r>
-                    <w:rPr>
-                      <w:rFonts w:ascii="Calibri" w:hAnsi="Calibri"/>
-                      <w:b w:val="0"/>
-                      <w:i w:val="0"/>
-                      <w:color w:val="0C4A6E"/>
-                      <w:sz w:val="20"/>
-                    </w:rPr>
-                    <w:t>TFC-_______________</w:t>
-                  </w:r>
-                </w:p>
-                <w:p>
-                  <w:pPr>
-                    <w:spacing w:before="0" w:after="40"/>
-                  </w:pPr>
-                  <w:r>
-                    <w:rPr>
-                      <w:rFonts w:ascii="Calibri" w:hAnsi="Calibri"/>
-                      <w:b/>
-                      <w:i w:val="0"/>
-                      <w:color w:val="0369A1"/>
-                      <w:sz w:val="16"/>
-                    </w:rPr>
-                    <w:t>RFID card</w:t>
-                  </w:r>
-                </w:p>
-                <w:p>
-                  <w:pPr>
-                    <w:spacing w:before="0" w:after="40"/>
-                  </w:pPr>
-                  <w:r>
-                    <w:rPr>
-                      <w:rFonts w:ascii="Calibri" w:hAnsi="Calibri"/>
-                      <w:b w:val="0"/>
-                      <w:i w:val="0"/>
-                      <w:color w:val="0C4A6E"/>
-                      <w:sz w:val="20"/>
+                      <w:sz w:val="22"/>
                     </w:rPr>
                     <w:t>…____________</w:t>
                   </w:r>
@@ -448,25 +551,136 @@
               <w:tblLook w:firstColumn="1" w:firstRow="1" w:lastColumn="0" w:lastRow="0" w:noHBand="0" w:noVBand="1" w:val="04A0"/>
             </w:tblPr>
             <w:tblGrid>
-              <w:gridCol w:w="3600"/>
-              <w:gridCol w:w="3600"/>
+              <w:gridCol w:w="3744"/>
+              <w:gridCol w:w="3744"/>
+            </w:tblGrid>
+            <w:tr>
+              <w:tc>
+                <w:tcPr>
+                  <w:tcW w:type="dxa" w:w="4320"/>
+                  <w:shd w:val="clear" w:color="auto" w:fill="FFFFFF"/>
+                  <w:tcMar>
+                    <w:top w:w="60" w:type="dxa"/>
+                    <w:bottom w:w="120" w:type="dxa"/>
+                    <w:start w:w="200" w:type="dxa"/>
+                    <w:end w:w="140" w:type="dxa"/>
+                  </w:tcMar>
+                </w:tcPr>
+                <w:p>
+                  <w:pPr>
+                    <w:spacing w:before="0" w:after="40" w:line="240" w:lineRule="auto"/>
+                  </w:pPr>
+                  <w:r>
+                    <w:rPr>
+                      <w:rFonts w:ascii="Calibri" w:hAnsi="Calibri"/>
+                      <w:b/>
+                      <w:i w:val="0"/>
+                      <w:color w:val="0369A1"/>
+                      <w:sz w:val="15"/>
+                      <w:caps w:val="true"/>
+                      <w:spacing w:val="20"/>
+                    </w:rPr>
+                    <w:t>Valid through</w:t>
+                  </w:r>
+                </w:p>
+                <w:p>
+                  <w:pPr>
+                    <w:spacing w:before="0" w:after="40" w:line="240" w:lineRule="auto"/>
+                  </w:pPr>
+                  <w:r>
+                    <w:rPr>
+                      <w:rFonts w:ascii="Calibri" w:hAnsi="Calibri"/>
+                      <w:b w:val="0"/>
+                      <w:i w:val="0"/>
+                      <w:color w:val="0C4A6E"/>
+                      <w:sz w:val="20"/>
+                    </w:rPr>
+                    <w:t>____ / __________</w:t>
+                  </w:r>
+                </w:p>
+              </w:tc>
+              <w:tc>
+                <w:tcPr>
+                  <w:tcW w:type="dxa" w:w="3168"/>
+                  <w:shd w:val="clear" w:color="auto" w:fill="FFFFFF"/>
+                  <w:tcMar>
+                    <w:top w:w="60" w:type="dxa"/>
+                    <w:bottom w:w="120" w:type="dxa"/>
+                    <w:start w:w="140" w:type="dxa"/>
+                    <w:end w:w="200" w:type="dxa"/>
+                  </w:tcMar>
+                </w:tcPr>
+                <w:p>
+                  <w:pPr>
+                    <w:spacing w:before="0" w:after="40" w:line="240" w:lineRule="auto"/>
+                    <w:jc w:val="right"/>
+                  </w:pPr>
+                  <w:r>
+                    <w:rPr>
+                      <w:rFonts w:ascii="Calibri" w:hAnsi="Calibri"/>
+                      <w:b w:val="0"/>
+                      <w:i w:val="0"/>
+                      <w:color w:val="0C4A6E"/>
+                      <w:sz w:val="20"/>
+                    </w:rPr>
+                    <w:t>_____________________</w:t>
+                  </w:r>
+                </w:p>
+                <w:p>
+                  <w:pPr>
+                    <w:spacing w:before="0" w:after="40" w:line="240" w:lineRule="auto"/>
+                    <w:jc w:val="right"/>
+                  </w:pPr>
+                  <w:r>
+                    <w:rPr>
+                      <w:rFonts w:ascii="Calibri" w:hAnsi="Calibri"/>
+                      <w:b/>
+                      <w:i w:val="0"/>
+                      <w:color w:val="0369A1"/>
+                      <w:sz w:val="15"/>
+                      <w:caps w:val="true"/>
+                      <w:spacing w:val="20"/>
+                    </w:rPr>
+                    <w:t>Authorized signature</w:t>
+                  </w:r>
+                </w:p>
+              </w:tc>
+            </w:tr>
+          </w:tbl>
+          <w:p/>
+          <w:tbl>
+            <w:tblPr>
+              <w:tblW w:type="auto" w:w="0"/>
+              <w:tblLayout w:type="fixed"/>
+              <w:tblLook w:firstColumn="1" w:firstRow="1" w:lastColumn="0" w:lastRow="0" w:noHBand="0" w:noVBand="1" w:val="04A0"/>
+            </w:tblPr>
+            <w:tblGrid>
+              <w:gridCol w:w="3744"/>
+              <w:gridCol w:w="3744"/>
             </w:tblGrid>
             <w:tr>
               <w:tc>
                 <w:tcPr>
                   <w:tcW w:type="dxa" w:w="4608"/>
                   <w:shd w:val="clear" w:color="auto" w:fill="E0F2FE"/>
+                  <w:vAlign w:val="center"/>
+                  <w:tcMar>
+                    <w:top w:w="80" w:type="dxa"/>
+                    <w:bottom w:w="80" w:type="dxa"/>
+                    <w:start w:w="200" w:type="dxa"/>
+                    <w:end w:w="120" w:type="dxa"/>
+                  </w:tcMar>
                 </w:tcPr>
                 <w:p>
                   <w:pPr>
-                    <w:spacing w:before="0" w:after="40"/>
+                    <w:spacing w:before="0" w:after="40" w:line="240" w:lineRule="auto"/>
                   </w:pPr>
                   <w:r>
                     <w:rPr>
                       <w:rFonts w:ascii="Calibri" w:hAnsi="Calibri"/>
                       <w:b w:val="0"/>
                       <w:i w:val="0"/>
-                      <w:color w:val="0369A1"/>
+                      <w:color w:val="075A85"/>
                       <w:sz w:val="16"/>
                     </w:rPr>
                     <w:t>Annaba, beside Dubai Wedding Hall</w:t>
@@ -475,12 +689,19 @@
               </w:tc>
               <w:tc>
                 <w:tcPr>
-                  <w:tcW w:type="dxa" w:w="2592"/>
+                  <w:tcW w:type="dxa" w:w="2880"/>
                   <w:shd w:val="clear" w:color="auto" w:fill="E0F2FE"/>
+                  <w:vAlign w:val="center"/>
+                  <w:tcMar>
+                    <w:top w:w="80" w:type="dxa"/>
+                    <w:bottom w:w="80" w:type="dxa"/>
+                    <w:start w:w="120" w:type="dxa"/>
+                    <w:end w:w="200" w:type="dxa"/>
+                  </w:tcMar>
                 </w:tcPr>
                 <w:p>
                   <w:pPr>
-                    <w:spacing w:before="0" w:after="40"/>
+                    <w:spacing w:before="0" w:after="40" w:line="240" w:lineRule="auto"/>
                     <w:jc w:val="right"/>
                   </w:pPr>
                   <w:r>
@@ -488,7 +709,7 @@
                       <w:rFonts w:ascii="Calibri" w:hAnsi="Calibri"/>
                       <w:b w:val="0"/>
                       <w:i w:val="0"/>
-                      <w:color w:val="0369A1"/>
+                      <w:color w:val="075A85"/>
                       <w:sz w:val="16"/>
                     </w:rPr>
                     <w:t>+213 561 502 098</w:t>
@@ -501,27 +722,34 @@
           <w:tbl>
             <w:tblPr>
               <w:tblW w:type="auto" w:w="0"/>
+              <w:tblLayout w:type="fixed"/>
               <w:tblLook w:firstColumn="1" w:firstRow="1" w:lastColumn="0" w:lastRow="0" w:noHBand="0" w:noVBand="1" w:val="04A0"/>
             </w:tblPr>
             <w:tblGrid>
-              <w:gridCol w:w="7200"/>
+              <w:gridCol w:w="7488"/>
             </w:tblGrid>
             <w:tr>
               <w:tc>
                 <w:tcPr>
-                  <w:tcW w:type="dxa" w:w="7200"/>
+                  <w:tcW w:type="dxa" w:w="7488"/>
                   <w:shd w:val="clear" w:color="auto" w:fill="2563EB"/>
+                  <w:tcMar>
+                    <w:top w:w="0" w:type="dxa"/>
+                    <w:bottom w:w="0" w:type="dxa"/>
+                    <w:start w:w="0" w:type="dxa"/>
+                    <w:end w:w="0" w:type="dxa"/>
+                  </w:tcMar>
                 </w:tcPr>
                 <w:p>
                   <w:pPr>
-                    <w:spacing w:before="0" w:after="40"/>
+                    <w:spacing w:before="0" w:after="0" w:line="240" w:lineRule="auto"/>
                   </w:pPr>
                   <w:r>
                     <w:rPr>
                       <w:rFonts w:ascii="Calibri" w:hAnsi="Calibri"/>
                       <w:b w:val="0"/>
                       <w:i w:val="0"/>
-                      <w:sz w:val="6"/>
+                      <w:sz w:val="10"/>
                     </w:rPr>
                     <w:t xml:space="preserve"> </w:t>
                   </w:r>
@@ -544,19 +772,38 @@
           <w:b w:val="0"/>
           <w:i/>
           <w:color w:val="0369A1"/>
-          <w:sz w:val="18"/>
+          <w:sz w:val="17"/>
         </w:rPr>
-        <w:t>Tip: replace the blank lines with each person's details, and paste a photo into the PHOTO box. Use one card per page.</w:t>
+        <w:t>Replace the blank lines with each person's details and paste a photo into the box. The faded TFC logo sits behind the card as a watermark.</w:t>
       </w:r>
     </w:p>
     <w:sectPr>
+      <w:headerReference w:type="default" r:id="rId9"/>
       <w:pgSz w:w="12240" w:h="15840"/>
-      <w:pgMar w:top="1152" w:right="1440" w:bottom="1152" w:left="1440" w:header="720" w:footer="720" w:gutter="0"/>
+      <w:pgMar w:top="1008" w:right="1296" w:bottom="1008" w:left="1296" w:header="720" w:footer="720" w:gutter="0"/>
       <w:cols w:space="720"/>
       <w:docGrid w:linePitch="360"/>
     </w:sectPr>
   </w:body>
 </w:document>
+</file>
+
+<file path=word/header1.xml><?xml version="1.0" encoding="utf-8"?>
+<w:hdr xmlns:m="http://schemas.openxmlformats.org/officeDocument/2006/math" xmlns:mc="http://schemas.openxmlformats.org/markup-compatibility/2006" xmlns:mo="http://schemas.microsoft.com/office/mac/office/2008/main" xmlns:mv="urn:schemas-microsoft-com:mac:vml" xmlns:o="urn:schemas-microsoft-com:office:office" xmlns:r="http://schemas.openxmlformats.org/officeDocument/2006/relationships" xmlns:v="urn:schemas-microsoft-com:vml" xmlns:w10="urn:schemas-microsoft-com:office:word" xmlns:w14="http://schemas.microsoft.com/office/word/2010/wordml" xmlns:w="http://schemas.openxmlformats.org/wordprocessingml/2006/main" xmlns:wne="http://schemas.microsoft.com/office/word/2006/wordml" xmlns:wp14="http://schemas.microsoft.com/office/word/2010/wordprocessingDrawing" xmlns:wp="http://schemas.openxmlformats.org/drawingml/2006/wordprocessingDrawing" xmlns:wpc="http://schemas.microsoft.com/office/word/2010/wordprocessingCanvas" xmlns:wpg="http://schemas.microsoft.com/office/word/2010/wordprocessingGroup" xmlns:wpi="http://schemas.microsoft.com/office/word/2010/wordprocessingInk" xmlns:wps="http://schemas.microsoft.com/office/word/2010/wordprocessingShape" mc:Ignorable="w14 wp14">
+  <w:p>
+    <w:pPr>
+      <w:pStyle w:val="Header"/>
+      <w:jc w:val="center"/>
+    </w:pPr>
+    <w:r>
+      <w:pict>
+        <v:shape id="tfc_watermark" type="#_x0000_t75" style="position:absolute;margin-left:0;margin-top:0;width:300pt;height:300pt;z-index:-251658240;mso-position-horizontal:center;mso-position-horizontal-relative:margin;mso-position-vertical:center;mso-position-vertical-relative:margin">
+          <v:imagedata r:id="rId1" o:title="TFC"/>
+        </v:shape>
+      </w:pict>
+    </w:r>
+  </w:p>
+</w:hdr>
 </file>
 
 <file path=word/numbering.xml><?xml version="1.0" encoding="utf-8"?>

</xml_diff>

<commit_message>
Redesign Word ID card: CR80 size, navy + white, logo watermark
Replace the template with a true credit-card-size (85.6 x 54 mm) card:
dark navy and white like the logo, full-card logo background watermark,
no photo box, blank editable fields. Sky accent bar and rounded corners.

https://claude.ai/code/session_01VeE5pevma4QUbkZrBAwbXG
</commit_message>
<xml_diff>
--- a/TFC-ID-Card-Template.docx
+++ b/TFC-ID-Card-Template.docx
@@ -11,11 +11,11 @@
           <w:rFonts w:ascii="Calibri" w:hAnsi="Calibri"/>
           <w:b/>
           <w:i w:val="0"/>
-          <w:color w:val="0C4A6E"/>
-          <w:sz w:val="30"/>
-          <w:spacing w:val="30"/>
+          <w:color w:val="0B172A"/>
+          <w:sz w:val="26"/>
+          <w:spacing w:val="40"/>
         </w:rPr>
-        <w:t>OFFICIAL IDENTITY CARD</w:t>
+        <w:t>OFFICIAL ID CARD — TFC</w:t>
       </w:r>
     </w:p>
     <w:p>
@@ -27,15 +27,15 @@
           <w:rFonts w:ascii="Calibri" w:hAnsi="Calibri"/>
           <w:b w:val="0"/>
           <w:i/>
-          <w:color w:val="0369A1"/>
+          <w:color w:val="475569"/>
           <w:sz w:val="18"/>
         </w:rPr>
-        <w:t>Training Formation Center  ·  editable template</w:t>
+        <w:t>standard card size · fill in the blanks</w:t>
       </w:r>
     </w:p>
     <w:p>
       <w:pPr>
-        <w:spacing w:after="40"/>
+        <w:spacing w:after="80"/>
       </w:pPr>
     </w:p>
     <w:tbl>
@@ -46,718 +46,231 @@
         <w:tblLook w:firstColumn="1" w:firstRow="1" w:lastColumn="0" w:lastRow="0" w:noHBand="0" w:noVBand="1" w:val="04A0"/>
       </w:tblPr>
       <w:tblGrid>
-        <w:gridCol w:w="9648"/>
+        <w:gridCol w:w="9360"/>
       </w:tblGrid>
       <w:tr>
+        <w:trPr>
+          <w:trHeight w:val="3060" w:hRule="exact"/>
+        </w:trPr>
         <w:tc>
           <w:tcPr>
-            <w:tcW w:type="dxa" w:w="7488"/>
-            <w:shd w:val="clear" w:color="auto" w:fill="FFFFFF"/>
-            <w:tcBorders>
-              <w:top w:val="single" w:sz="20" w:space="0" w:color="0EA5E9"/>
-              <w:left w:val="single" w:sz="20" w:space="0" w:color="0EA5E9"/>
-              <w:bottom w:val="single" w:sz="20" w:space="0" w:color="0EA5E9"/>
-              <w:right w:val="single" w:sz="20" w:space="0" w:color="0EA5E9"/>
-            </w:tcBorders>
+            <w:tcW w:type="dxa" w:w="4860"/>
+            <w:shd w:val="clear" w:color="auto" w:fill="0B172A"/>
             <w:tcMar>
-              <w:top w:w="0" w:type="dxa"/>
-              <w:bottom w:w="0" w:type="dxa"/>
-              <w:start w:w="0" w:type="dxa"/>
-              <w:end w:w="0" w:type="dxa"/>
+              <w:top w:w="180" w:type="dxa"/>
+              <w:bottom w:w="120" w:type="dxa"/>
+              <w:start w:w="300" w:type="dxa"/>
+              <w:end w:w="240" w:type="dxa"/>
             </w:tcMar>
           </w:tcPr>
-          <w:tbl>
-            <w:tblPr>
-              <w:tblW w:type="auto" w:w="0"/>
-              <w:tblLayout w:type="fixed"/>
-              <w:tblLook w:firstColumn="1" w:firstRow="1" w:lastColumn="0" w:lastRow="0" w:noHBand="0" w:noVBand="1" w:val="04A0"/>
-            </w:tblPr>
-            <w:tblGrid>
-              <w:gridCol w:w="7488"/>
-            </w:tblGrid>
-            <w:tr>
-              <w:tc>
-                <w:tcPr>
-                  <w:tcW w:type="dxa" w:w="7488"/>
-                  <w:shd w:val="clear" w:color="auto" w:fill="0EA5E9"/>
-                  <w:tcMar>
-                    <w:top w:w="0" w:type="dxa"/>
-                    <w:bottom w:w="0" w:type="dxa"/>
-                    <w:start w:w="0" w:type="dxa"/>
-                    <w:end w:w="0" w:type="dxa"/>
-                  </w:tcMar>
-                </w:tcPr>
-                <w:p>
-                  <w:pPr>
-                    <w:spacing w:before="0" w:after="0" w:line="240" w:lineRule="auto"/>
-                  </w:pPr>
-                  <w:r>
-                    <w:rPr>
-                      <w:rFonts w:ascii="Calibri" w:hAnsi="Calibri"/>
-                      <w:b w:val="0"/>
-                      <w:i w:val="0"/>
-                      <w:sz w:val="10"/>
-                    </w:rPr>
-                    <w:t xml:space="preserve"> </w:t>
-                  </w:r>
-                </w:p>
-              </w:tc>
-            </w:tr>
-          </w:tbl>
-          <w:p/>
-          <w:tbl>
-            <w:tblPr>
-              <w:tblW w:type="auto" w:w="0"/>
-              <w:tblLayout w:type="fixed"/>
-              <w:tblLook w:firstColumn="1" w:firstRow="1" w:lastColumn="0" w:lastRow="0" w:noHBand="0" w:noVBand="1" w:val="04A0"/>
-            </w:tblPr>
-            <w:tblGrid>
-              <w:gridCol w:w="2496"/>
-              <w:gridCol w:w="2496"/>
-              <w:gridCol w:w="2496"/>
-            </w:tblGrid>
-            <w:tr>
-              <w:tc>
-                <w:tcPr>
-                  <w:tcW w:type="dxa" w:w="1440"/>
-                  <w:shd w:val="clear" w:color="auto" w:fill="2563EB"/>
-                  <w:vAlign w:val="center"/>
-                  <w:tcMar>
-                    <w:top w:w="120" w:type="dxa"/>
-                    <w:bottom w:w="120" w:type="dxa"/>
-                    <w:start w:w="140" w:type="dxa"/>
-                    <w:end w:w="140" w:type="dxa"/>
-                  </w:tcMar>
-                </w:tcPr>
-                <w:p>
-                  <w:pPr>
-                    <w:spacing w:before="0" w:after="40" w:line="240" w:lineRule="auto"/>
-                    <w:jc w:val="center"/>
-                  </w:pPr>
-                  <w:r>
-                    <w:drawing>
-                      <wp:inline xmlns:a="http://schemas.openxmlformats.org/drawingml/2006/main" xmlns:pic="http://schemas.openxmlformats.org/drawingml/2006/picture">
-                        <wp:extent cx="640080" cy="642851"/>
-                        <wp:docPr id="1" name="Picture 1"/>
-                        <wp:cNvGraphicFramePr>
-                          <a:graphicFrameLocks noChangeAspect="1"/>
-                        </wp:cNvGraphicFramePr>
-                        <a:graphic>
-                          <a:graphicData uri="http://schemas.openxmlformats.org/drawingml/2006/picture">
-                            <pic:pic>
-                              <pic:nvPicPr>
-                                <pic:cNvPr id="0" name="tfc-logo.png"/>
-                                <pic:cNvPicPr/>
-                              </pic:nvPicPr>
-                              <pic:blipFill>
-                                <a:blip r:embed="rId10"/>
-                                <a:stretch>
-                                  <a:fillRect/>
-                                </a:stretch>
-                              </pic:blipFill>
-                              <pic:spPr>
-                                <a:xfrm>
-                                  <a:off x="0" y="0"/>
-                                  <a:ext cx="640080" cy="642851"/>
-                                </a:xfrm>
-                                <a:prstGeom prst="rect"/>
-                              </pic:spPr>
-                            </pic:pic>
-                          </a:graphicData>
-                        </a:graphic>
-                      </wp:inline>
-                    </w:drawing>
-                  </w:r>
-                </w:p>
-              </w:tc>
-              <w:tc>
-                <w:tcPr>
-                  <w:tcW w:type="dxa" w:w="3888"/>
-                  <w:shd w:val="clear" w:color="auto" w:fill="2563EB"/>
-                  <w:vAlign w:val="center"/>
-                  <w:tcMar>
-                    <w:top w:w="120" w:type="dxa"/>
-                    <w:bottom w:w="120" w:type="dxa"/>
-                    <w:start w:w="140" w:type="dxa"/>
-                    <w:end w:w="140" w:type="dxa"/>
-                  </w:tcMar>
-                </w:tcPr>
-                <w:p>
-                  <w:pPr>
-                    <w:spacing w:before="0" w:after="40" w:line="240" w:lineRule="auto"/>
-                  </w:pPr>
-                  <w:r>
-                    <w:rPr>
-                      <w:rFonts w:ascii="Calibri" w:hAnsi="Calibri"/>
-                      <w:b/>
-                      <w:i w:val="0"/>
-                      <w:color w:val="FFFFFF"/>
-                      <w:sz w:val="24"/>
-                    </w:rPr>
-                    <w:t>TRAINING FORMATION CENTER</w:t>
-                  </w:r>
-                </w:p>
-                <w:p>
-                  <w:pPr>
-                    <w:spacing w:before="0" w:after="40" w:line="240" w:lineRule="auto"/>
-                  </w:pPr>
-                  <w:r>
-                    <w:rPr>
-                      <w:rFonts w:ascii="Calibri" w:hAnsi="Calibri"/>
-                      <w:b w:val="0"/>
-                      <w:i/>
-                      <w:color w:val="DBEAFE"/>
-                      <w:sz w:val="16"/>
-                    </w:rPr>
-                    <w:t>Student / Staff Identity Card</w:t>
-                  </w:r>
-                </w:p>
-              </w:tc>
-              <w:tc>
-                <w:tcPr>
-                  <w:tcW w:type="dxa" w:w="2160"/>
-                  <w:shd w:val="clear" w:color="auto" w:fill="2563EB"/>
-                  <w:vAlign w:val="center"/>
-                  <w:tcMar>
-                    <w:top w:w="120" w:type="dxa"/>
-                    <w:bottom w:w="120" w:type="dxa"/>
-                    <w:start w:w="140" w:type="dxa"/>
-                    <w:end w:w="140" w:type="dxa"/>
-                  </w:tcMar>
-                </w:tcPr>
-                <w:p>
-                  <w:pPr>
-                    <w:spacing w:before="0" w:after="40" w:line="240" w:lineRule="auto"/>
-                    <w:jc w:val="right"/>
-                  </w:pPr>
-                  <w:r>
-                    <w:rPr>
-                      <w:rFonts w:ascii="Calibri" w:hAnsi="Calibri"/>
-                      <w:b/>
-                      <w:i w:val="0"/>
-                      <w:color w:val="BFDBFE"/>
-                      <w:sz w:val="15"/>
-                      <w:caps w:val="true"/>
-                      <w:spacing w:val="20"/>
-                    </w:rPr>
-                    <w:t>ID No.</w:t>
-                  </w:r>
-                </w:p>
-                <w:p>
-                  <w:pPr>
-                    <w:spacing w:before="0" w:after="40" w:line="240" w:lineRule="auto"/>
-                    <w:jc w:val="right"/>
-                  </w:pPr>
-                  <w:r>
-                    <w:rPr>
-                      <w:rFonts w:ascii="Calibri" w:hAnsi="Calibri"/>
-                      <w:b/>
-                      <w:i w:val="0"/>
-                      <w:color w:val="FFFFFF"/>
-                      <w:sz w:val="24"/>
-                    </w:rPr>
-                    <w:t>TFC-______</w:t>
-                  </w:r>
-                </w:p>
-              </w:tc>
-            </w:tr>
-          </w:tbl>
-          <w:p/>
-          <w:tbl>
-            <w:tblPr>
-              <w:tblW w:type="auto" w:w="0"/>
-              <w:tblLayout w:type="fixed"/>
-              <w:tblLook w:firstColumn="1" w:firstRow="1" w:lastColumn="0" w:lastRow="0" w:noHBand="0" w:noVBand="1" w:val="04A0"/>
-            </w:tblPr>
-            <w:tblGrid>
-              <w:gridCol w:w="3744"/>
-              <w:gridCol w:w="3744"/>
-            </w:tblGrid>
-            <w:tr>
-              <w:tc>
-                <w:tcPr>
-                  <w:tcW w:type="dxa" w:w="2304"/>
-                  <w:shd w:val="clear" w:color="auto" w:fill="F0F9FF"/>
-                  <w:vAlign w:val="center"/>
-                  <w:tcMar>
-                    <w:top w:w="160" w:type="dxa"/>
-                    <w:bottom w:w="160" w:type="dxa"/>
-                    <w:start w:w="140" w:type="dxa"/>
-                    <w:end w:w="140" w:type="dxa"/>
-                  </w:tcMar>
-                </w:tcPr>
-                <w:p/>
-                <w:tbl>
-                  <w:tblPr>
-                    <w:tblW w:type="auto" w:w="0"/>
-                    <w:tblLayout w:type="fixed"/>
-                    <w:tblLook w:firstColumn="1" w:firstRow="1" w:lastColumn="0" w:lastRow="0" w:noHBand="0" w:noVBand="1" w:val="04A0"/>
-                  </w:tblPr>
-                  <w:tblGrid>
-                    <w:gridCol w:w="2304"/>
-                  </w:tblGrid>
-                  <w:tr>
-                    <w:tc>
-                      <w:tcPr>
-                        <w:tcW w:type="dxa" w:w="1800"/>
-                        <w:shd w:val="clear" w:color="auto" w:fill="FFFFFF"/>
-                        <w:tcBorders>
-                          <w:top w:val="single" w:sz="14" w:space="0" w:color="38BDF8"/>
-                          <w:left w:val="single" w:sz="14" w:space="0" w:color="38BDF8"/>
-                          <w:bottom w:val="single" w:sz="14" w:space="0" w:color="38BDF8"/>
-                          <w:right w:val="single" w:sz="14" w:space="0" w:color="38BDF8"/>
-                        </w:tcBorders>
-                        <w:tcMar>
-                          <w:top w:w="420" w:type="dxa"/>
-                          <w:bottom w:w="420" w:type="dxa"/>
-                          <w:start w:w="60" w:type="dxa"/>
-                          <w:end w:w="60" w:type="dxa"/>
-                        </w:tcMar>
-                        <w:vAlign w:val="center"/>
-                      </w:tcPr>
-                      <w:p>
-                        <w:pPr>
-                          <w:spacing w:before="0" w:after="40" w:line="240" w:lineRule="auto"/>
-                          <w:jc w:val="center"/>
-                        </w:pPr>
-                        <w:r>
-                          <w:rPr>
-                            <w:rFonts w:ascii="Calibri" w:hAnsi="Calibri"/>
-                            <w:b/>
-                            <w:i w:val="0"/>
-                            <w:color w:val="0EA5E9"/>
-                            <w:sz w:val="22"/>
-                            <w:caps w:val="true"/>
-                            <w:spacing w:val="20"/>
-                          </w:rPr>
-                          <w:t>PHOTO</w:t>
-                        </w:r>
-                      </w:p>
-                      <w:p>
-                        <w:pPr>
-                          <w:spacing w:before="0" w:after="40" w:line="240" w:lineRule="auto"/>
-                          <w:jc w:val="center"/>
-                        </w:pPr>
-                        <w:r>
-                          <w:rPr>
-                            <w:rFonts w:ascii="Calibri" w:hAnsi="Calibri"/>
-                            <w:b w:val="0"/>
-                            <w:i/>
-                            <w:color w:val="0369A1"/>
-                            <w:sz w:val="16"/>
-                          </w:rPr>
-                          <w:t>paste here</w:t>
-                        </w:r>
-                      </w:p>
-                    </w:tc>
-                  </w:tr>
-                </w:tbl>
-                <w:p/>
-              </w:tc>
-              <w:tc>
-                <w:tcPr>
-                  <w:tcW w:type="dxa" w:w="5184"/>
-                  <w:shd w:val="clear" w:color="auto" w:fill="FFFFFF"/>
-                  <w:tcMar>
-                    <w:top w:w="160" w:type="dxa"/>
-                    <w:bottom w:w="160" w:type="dxa"/>
-                    <w:start w:w="200" w:type="dxa"/>
-                    <w:end w:w="160" w:type="dxa"/>
-                  </w:tcMar>
-                </w:tcPr>
-                <w:p>
-                  <w:pPr>
-                    <w:spacing w:before="0" w:after="0" w:line="240" w:lineRule="auto"/>
-                  </w:pPr>
-                  <w:r>
-                    <w:rPr>
-                      <w:rFonts w:ascii="Calibri" w:hAnsi="Calibri"/>
-                      <w:b/>
-                      <w:i w:val="0"/>
-                      <w:color w:val="0369A1"/>
-                      <w:sz w:val="15"/>
-                      <w:caps w:val="true"/>
-                      <w:spacing w:val="20"/>
-                    </w:rPr>
-                    <w:t>Full name</w:t>
-                  </w:r>
-                </w:p>
-                <w:p>
-                  <w:pPr>
-                    <w:spacing w:before="0" w:after="120" w:line="240" w:lineRule="auto"/>
-                    <w:pBdr>
-                      <w:bottom w:val="single" w:sz="4" w:space="2" w:color="BAE6FD"/>
-                    </w:pBdr>
-                  </w:pPr>
-                  <w:r>
-                    <w:rPr>
-                      <w:rFonts w:ascii="Calibri" w:hAnsi="Calibri"/>
-                      <w:b/>
-                      <w:i w:val="0"/>
-                      <w:color w:val="0C4A6E"/>
-                      <w:sz w:val="26"/>
-                    </w:rPr>
-                    <w:t>______________________________</w:t>
-                  </w:r>
-                </w:p>
-                <w:p>
-                  <w:pPr>
-                    <w:spacing w:before="0" w:after="0" w:line="240" w:lineRule="auto"/>
-                  </w:pPr>
-                  <w:r>
-                    <w:rPr>
-                      <w:rFonts w:ascii="Calibri" w:hAnsi="Calibri"/>
-                      <w:b/>
-                      <w:i w:val="0"/>
-                      <w:color w:val="0369A1"/>
-                      <w:sz w:val="15"/>
-                      <w:caps w:val="true"/>
-                      <w:spacing w:val="20"/>
-                    </w:rPr>
-                    <w:t>Date of birth</w:t>
-                  </w:r>
-                </w:p>
-                <w:p>
-                  <w:pPr>
-                    <w:spacing w:before="0" w:after="120" w:line="240" w:lineRule="auto"/>
-                    <w:pBdr>
-                      <w:bottom w:val="single" w:sz="4" w:space="2" w:color="BAE6FD"/>
-                    </w:pBdr>
-                  </w:pPr>
-                  <w:r>
-                    <w:rPr>
-                      <w:rFonts w:ascii="Calibri" w:hAnsi="Calibri"/>
-                      <w:b w:val="0"/>
-                      <w:i w:val="0"/>
-                      <w:color w:val="0C4A6E"/>
-                      <w:sz w:val="22"/>
-                    </w:rPr>
-                    <w:t>____ / ____ / __________</w:t>
-                  </w:r>
-                </w:p>
-                <w:p>
-                  <w:pPr>
-                    <w:spacing w:before="0" w:after="0" w:line="240" w:lineRule="auto"/>
-                  </w:pPr>
-                  <w:r>
-                    <w:rPr>
-                      <w:rFonts w:ascii="Calibri" w:hAnsi="Calibri"/>
-                      <w:b/>
-                      <w:i w:val="0"/>
-                      <w:color w:val="0369A1"/>
-                      <w:sz w:val="15"/>
-                      <w:caps w:val="true"/>
-                      <w:spacing w:val="20"/>
-                    </w:rPr>
-                    <w:t>Course / Subject</w:t>
-                  </w:r>
-                </w:p>
-                <w:p>
-                  <w:pPr>
-                    <w:spacing w:before="0" w:after="120" w:line="240" w:lineRule="auto"/>
-                    <w:pBdr>
-                      <w:bottom w:val="single" w:sz="4" w:space="2" w:color="BAE6FD"/>
-                    </w:pBdr>
-                  </w:pPr>
-                  <w:r>
-                    <w:rPr>
-                      <w:rFonts w:ascii="Calibri" w:hAnsi="Calibri"/>
-                      <w:b w:val="0"/>
-                      <w:i w:val="0"/>
-                      <w:color w:val="0C4A6E"/>
-                      <w:sz w:val="22"/>
-                    </w:rPr>
-                    <w:t>______________________________</w:t>
-                  </w:r>
-                </w:p>
-                <w:p>
-                  <w:pPr>
-                    <w:spacing w:before="0" w:after="0" w:line="240" w:lineRule="auto"/>
-                  </w:pPr>
-                  <w:r>
-                    <w:rPr>
-                      <w:rFonts w:ascii="Calibri" w:hAnsi="Calibri"/>
-                      <w:b/>
-                      <w:i w:val="0"/>
-                      <w:color w:val="0369A1"/>
-                      <w:sz w:val="15"/>
-                      <w:caps w:val="true"/>
-                      <w:spacing w:val="20"/>
-                    </w:rPr>
-                    <w:t>Card ID</w:t>
-                  </w:r>
-                </w:p>
-                <w:p>
-                  <w:pPr>
-                    <w:spacing w:before="0" w:after="120" w:line="240" w:lineRule="auto"/>
-                    <w:pBdr>
-                      <w:bottom w:val="single" w:sz="4" w:space="2" w:color="BAE6FD"/>
-                    </w:pBdr>
-                  </w:pPr>
-                  <w:r>
-                    <w:rPr>
-                      <w:rFonts w:ascii="Calibri" w:hAnsi="Calibri"/>
-                      <w:b w:val="0"/>
-                      <w:i w:val="0"/>
-                      <w:color w:val="0C4A6E"/>
-                      <w:sz w:val="22"/>
-                    </w:rPr>
-                    <w:t>TFC-_______________</w:t>
-                  </w:r>
-                </w:p>
-                <w:p>
-                  <w:pPr>
-                    <w:spacing w:before="0" w:after="0" w:line="240" w:lineRule="auto"/>
-                  </w:pPr>
-                  <w:r>
-                    <w:rPr>
-                      <w:rFonts w:ascii="Calibri" w:hAnsi="Calibri"/>
-                      <w:b/>
-                      <w:i w:val="0"/>
-                      <w:color w:val="0369A1"/>
-                      <w:sz w:val="15"/>
-                      <w:caps w:val="true"/>
-                      <w:spacing w:val="20"/>
-                    </w:rPr>
-                    <w:t>RFID card</w:t>
-                  </w:r>
-                </w:p>
-                <w:p>
-                  <w:pPr>
-                    <w:spacing w:before="0" w:after="120" w:line="240" w:lineRule="auto"/>
-                    <w:pBdr>
-                      <w:bottom w:val="single" w:sz="4" w:space="2" w:color="BAE6FD"/>
-                    </w:pBdr>
-                  </w:pPr>
-                  <w:r>
-                    <w:rPr>
-                      <w:rFonts w:ascii="Calibri" w:hAnsi="Calibri"/>
-                      <w:b w:val="0"/>
-                      <w:i w:val="0"/>
-                      <w:color w:val="0C4A6E"/>
-                      <w:sz w:val="22"/>
-                    </w:rPr>
-                    <w:t>…____________</w:t>
-                  </w:r>
-                </w:p>
-              </w:tc>
-            </w:tr>
-          </w:tbl>
-          <w:p/>
-          <w:tbl>
-            <w:tblPr>
-              <w:tblW w:type="auto" w:w="0"/>
-              <w:tblLayout w:type="fixed"/>
-              <w:tblLook w:firstColumn="1" w:firstRow="1" w:lastColumn="0" w:lastRow="0" w:noHBand="0" w:noVBand="1" w:val="04A0"/>
-            </w:tblPr>
-            <w:tblGrid>
-              <w:gridCol w:w="3744"/>
-              <w:gridCol w:w="3744"/>
-            </w:tblGrid>
-            <w:tr>
-              <w:tc>
-                <w:tcPr>
-                  <w:tcW w:type="dxa" w:w="4320"/>
-                  <w:shd w:val="clear" w:color="auto" w:fill="FFFFFF"/>
-                  <w:tcMar>
-                    <w:top w:w="60" w:type="dxa"/>
-                    <w:bottom w:w="120" w:type="dxa"/>
-                    <w:start w:w="200" w:type="dxa"/>
-                    <w:end w:w="140" w:type="dxa"/>
-                  </w:tcMar>
-                </w:tcPr>
-                <w:p>
-                  <w:pPr>
-                    <w:spacing w:before="0" w:after="40" w:line="240" w:lineRule="auto"/>
-                  </w:pPr>
-                  <w:r>
-                    <w:rPr>
-                      <w:rFonts w:ascii="Calibri" w:hAnsi="Calibri"/>
-                      <w:b/>
-                      <w:i w:val="0"/>
-                      <w:color w:val="0369A1"/>
-                      <w:sz w:val="15"/>
-                      <w:caps w:val="true"/>
-                      <w:spacing w:val="20"/>
-                    </w:rPr>
-                    <w:t>Valid through</w:t>
-                  </w:r>
-                </w:p>
-                <w:p>
-                  <w:pPr>
-                    <w:spacing w:before="0" w:after="40" w:line="240" w:lineRule="auto"/>
-                  </w:pPr>
-                  <w:r>
-                    <w:rPr>
-                      <w:rFonts w:ascii="Calibri" w:hAnsi="Calibri"/>
-                      <w:b w:val="0"/>
-                      <w:i w:val="0"/>
-                      <w:color w:val="0C4A6E"/>
-                      <w:sz w:val="20"/>
-                    </w:rPr>
-                    <w:t>____ / __________</w:t>
-                  </w:r>
-                </w:p>
-              </w:tc>
-              <w:tc>
-                <w:tcPr>
-                  <w:tcW w:type="dxa" w:w="3168"/>
-                  <w:shd w:val="clear" w:color="auto" w:fill="FFFFFF"/>
-                  <w:tcMar>
-                    <w:top w:w="60" w:type="dxa"/>
-                    <w:bottom w:w="120" w:type="dxa"/>
-                    <w:start w:w="140" w:type="dxa"/>
-                    <w:end w:w="200" w:type="dxa"/>
-                  </w:tcMar>
-                </w:tcPr>
-                <w:p>
-                  <w:pPr>
-                    <w:spacing w:before="0" w:after="40" w:line="240" w:lineRule="auto"/>
-                    <w:jc w:val="right"/>
-                  </w:pPr>
-                  <w:r>
-                    <w:rPr>
-                      <w:rFonts w:ascii="Calibri" w:hAnsi="Calibri"/>
-                      <w:b w:val="0"/>
-                      <w:i w:val="0"/>
-                      <w:color w:val="0C4A6E"/>
-                      <w:sz w:val="20"/>
-                    </w:rPr>
-                    <w:t>_____________________</w:t>
-                  </w:r>
-                </w:p>
-                <w:p>
-                  <w:pPr>
-                    <w:spacing w:before="0" w:after="40" w:line="240" w:lineRule="auto"/>
-                    <w:jc w:val="right"/>
-                  </w:pPr>
-                  <w:r>
-                    <w:rPr>
-                      <w:rFonts w:ascii="Calibri" w:hAnsi="Calibri"/>
-                      <w:b/>
-                      <w:i w:val="0"/>
-                      <w:color w:val="0369A1"/>
-                      <w:sz w:val="15"/>
-                      <w:caps w:val="true"/>
-                      <w:spacing w:val="20"/>
-                    </w:rPr>
-                    <w:t>Authorized signature</w:t>
-                  </w:r>
-                </w:p>
-              </w:tc>
-            </w:tr>
-          </w:tbl>
-          <w:p/>
-          <w:tbl>
-            <w:tblPr>
-              <w:tblW w:type="auto" w:w="0"/>
-              <w:tblLayout w:type="fixed"/>
-              <w:tblLook w:firstColumn="1" w:firstRow="1" w:lastColumn="0" w:lastRow="0" w:noHBand="0" w:noVBand="1" w:val="04A0"/>
-            </w:tblPr>
-            <w:tblGrid>
-              <w:gridCol w:w="3744"/>
-              <w:gridCol w:w="3744"/>
-            </w:tblGrid>
-            <w:tr>
-              <w:tc>
-                <w:tcPr>
-                  <w:tcW w:type="dxa" w:w="4608"/>
-                  <w:shd w:val="clear" w:color="auto" w:fill="E0F2FE"/>
-                  <w:vAlign w:val="center"/>
-                  <w:tcMar>
-                    <w:top w:w="80" w:type="dxa"/>
-                    <w:bottom w:w="80" w:type="dxa"/>
-                    <w:start w:w="200" w:type="dxa"/>
-                    <w:end w:w="120" w:type="dxa"/>
-                  </w:tcMar>
-                </w:tcPr>
-                <w:p>
-                  <w:pPr>
-                    <w:spacing w:before="0" w:after="40" w:line="240" w:lineRule="auto"/>
-                  </w:pPr>
-                  <w:r>
-                    <w:rPr>
-                      <w:rFonts w:ascii="Calibri" w:hAnsi="Calibri"/>
-                      <w:b w:val="0"/>
-                      <w:i w:val="0"/>
-                      <w:color w:val="075A85"/>
-                      <w:sz w:val="16"/>
-                    </w:rPr>
-                    <w:t>Annaba, beside Dubai Wedding Hall</w:t>
-                  </w:r>
-                </w:p>
-              </w:tc>
-              <w:tc>
-                <w:tcPr>
-                  <w:tcW w:type="dxa" w:w="2880"/>
-                  <w:shd w:val="clear" w:color="auto" w:fill="E0F2FE"/>
-                  <w:vAlign w:val="center"/>
-                  <w:tcMar>
-                    <w:top w:w="80" w:type="dxa"/>
-                    <w:bottom w:w="80" w:type="dxa"/>
-                    <w:start w:w="120" w:type="dxa"/>
-                    <w:end w:w="200" w:type="dxa"/>
-                  </w:tcMar>
-                </w:tcPr>
-                <w:p>
-                  <w:pPr>
-                    <w:spacing w:before="0" w:after="40" w:line="240" w:lineRule="auto"/>
-                    <w:jc w:val="right"/>
-                  </w:pPr>
-                  <w:r>
-                    <w:rPr>
-                      <w:rFonts w:ascii="Calibri" w:hAnsi="Calibri"/>
-                      <w:b w:val="0"/>
-                      <w:i w:val="0"/>
-                      <w:color w:val="075A85"/>
-                      <w:sz w:val="16"/>
-                    </w:rPr>
-                    <w:t>+213 561 502 098</w:t>
-                  </w:r>
-                </w:p>
-              </w:tc>
-            </w:tr>
-          </w:tbl>
-          <w:p/>
-          <w:tbl>
-            <w:tblPr>
-              <w:tblW w:type="auto" w:w="0"/>
-              <w:tblLayout w:type="fixed"/>
-              <w:tblLook w:firstColumn="1" w:firstRow="1" w:lastColumn="0" w:lastRow="0" w:noHBand="0" w:noVBand="1" w:val="04A0"/>
-            </w:tblPr>
-            <w:tblGrid>
-              <w:gridCol w:w="7488"/>
-            </w:tblGrid>
-            <w:tr>
-              <w:tc>
-                <w:tcPr>
-                  <w:tcW w:type="dxa" w:w="7488"/>
-                  <w:shd w:val="clear" w:color="auto" w:fill="2563EB"/>
-                  <w:tcMar>
-                    <w:top w:w="0" w:type="dxa"/>
-                    <w:bottom w:w="0" w:type="dxa"/>
-                    <w:start w:w="0" w:type="dxa"/>
-                    <w:end w:w="0" w:type="dxa"/>
-                  </w:tcMar>
-                </w:tcPr>
-                <w:p>
-                  <w:pPr>
-                    <w:spacing w:before="0" w:after="0" w:line="240" w:lineRule="auto"/>
-                  </w:pPr>
-                  <w:r>
-                    <w:rPr>
-                      <w:rFonts w:ascii="Calibri" w:hAnsi="Calibri"/>
-                      <w:b w:val="0"/>
-                      <w:i w:val="0"/>
-                      <w:sz w:val="10"/>
-                    </w:rPr>
-                    <w:t xml:space="preserve"> </w:t>
-                  </w:r>
-                </w:p>
-              </w:tc>
-            </w:tr>
-          </w:tbl>
-          <w:p/>
+          <w:p>
+            <w:pPr>
+              <w:spacing w:before="0" w:after="0" w:line="240" w:lineRule="auto"/>
+            </w:pPr>
+            <w:r>
+              <w:pict>
+                <v:shape id="tfc_card_bg" type="#_x0000_t75" style="position:absolute;left:0;top:0;width:243.0pt;height:153.0pt;z-index:-251658240;mso-position-horizontal:left;mso-position-vertical:top;mso-position-horizontal-relative:text;mso-position-vertical-relative:text" o:allowincell="t">
+                  <v:imagedata r:id="rId9" o:title="TFC"/>
+                </v:shape>
+              </w:pict>
+            </w:r>
+            <w:r>
+              <w:rPr>
+                <w:rFonts w:ascii="Calibri" w:hAnsi="Calibri"/>
+                <w:b/>
+                <w:i w:val="0"/>
+                <w:color w:val="FFFFFF"/>
+                <w:sz w:val="21"/>
+              </w:rPr>
+              <w:t>TRAINING FORMATION CENTER</w:t>
+            </w:r>
+          </w:p>
+          <w:p>
+            <w:pPr>
+              <w:spacing w:before="0" w:after="80" w:line="240" w:lineRule="auto"/>
+            </w:pPr>
+            <w:r>
+              <w:rPr>
+                <w:rFonts w:ascii="Calibri" w:hAnsi="Calibri"/>
+                <w:b w:val="0"/>
+                <w:i/>
+                <w:color w:val="7DD3FC"/>
+                <w:sz w:val="14"/>
+                <w:spacing w:val="20"/>
+              </w:rPr>
+              <w:t>Student / Staff Identity Card</w:t>
+            </w:r>
+          </w:p>
+          <w:p>
+            <w:pPr>
+              <w:spacing w:before="0" w:after="60" w:line="240" w:lineRule="auto"/>
+            </w:pPr>
+            <w:r>
+              <w:rPr>
+                <w:rFonts w:ascii="Calibri" w:hAnsi="Calibri"/>
+                <w:b/>
+                <w:i w:val="0"/>
+                <w:color w:val="BAE6FD"/>
+                <w:sz w:val="14"/>
+                <w:caps w:val="true"/>
+                <w:spacing w:val="20"/>
+              </w:rPr>
+              <w:t xml:space="preserve">Name  </w:t>
+            </w:r>
+            <w:r>
+              <w:rPr>
+                <w:rFonts w:ascii="Calibri" w:hAnsi="Calibri"/>
+                <w:b w:val="0"/>
+                <w:i w:val="0"/>
+                <w:color w:val="FFFFFF"/>
+                <w:sz w:val="20"/>
+              </w:rPr>
+              <w:t>______________________________</w:t>
+            </w:r>
+          </w:p>
+          <w:p>
+            <w:pPr>
+              <w:spacing w:before="0" w:after="60" w:line="240" w:lineRule="auto"/>
+            </w:pPr>
+            <w:r>
+              <w:rPr>
+                <w:rFonts w:ascii="Calibri" w:hAnsi="Calibri"/>
+                <w:b/>
+                <w:i w:val="0"/>
+                <w:color w:val="BAE6FD"/>
+                <w:sz w:val="14"/>
+                <w:caps w:val="true"/>
+                <w:spacing w:val="20"/>
+              </w:rPr>
+              <w:t xml:space="preserve">Date of birth  </w:t>
+            </w:r>
+            <w:r>
+              <w:rPr>
+                <w:rFonts w:ascii="Calibri" w:hAnsi="Calibri"/>
+                <w:b w:val="0"/>
+                <w:i w:val="0"/>
+                <w:color w:val="FFFFFF"/>
+                <w:sz w:val="18"/>
+              </w:rPr>
+              <w:t>____ / ____ / __________</w:t>
+            </w:r>
+          </w:p>
+          <w:p>
+            <w:pPr>
+              <w:spacing w:before="0" w:after="60" w:line="240" w:lineRule="auto"/>
+            </w:pPr>
+            <w:r>
+              <w:rPr>
+                <w:rFonts w:ascii="Calibri" w:hAnsi="Calibri"/>
+                <w:b/>
+                <w:i w:val="0"/>
+                <w:color w:val="BAE6FD"/>
+                <w:sz w:val="14"/>
+                <w:caps w:val="true"/>
+                <w:spacing w:val="20"/>
+              </w:rPr>
+              <w:t xml:space="preserve">Course / Subject  </w:t>
+            </w:r>
+            <w:r>
+              <w:rPr>
+                <w:rFonts w:ascii="Calibri" w:hAnsi="Calibri"/>
+                <w:b w:val="0"/>
+                <w:i w:val="0"/>
+                <w:color w:val="FFFFFF"/>
+                <w:sz w:val="18"/>
+              </w:rPr>
+              <w:t>______________________________</w:t>
+            </w:r>
+          </w:p>
+          <w:p>
+            <w:pPr>
+              <w:spacing w:before="0" w:after="60" w:line="240" w:lineRule="auto"/>
+            </w:pPr>
+            <w:r>
+              <w:rPr>
+                <w:rFonts w:ascii="Calibri" w:hAnsi="Calibri"/>
+                <w:b/>
+                <w:i w:val="0"/>
+                <w:color w:val="BAE6FD"/>
+                <w:sz w:val="14"/>
+                <w:caps w:val="true"/>
+                <w:spacing w:val="20"/>
+              </w:rPr>
+              <w:t xml:space="preserve">Card ID  </w:t>
+            </w:r>
+            <w:r>
+              <w:rPr>
+                <w:rFonts w:ascii="Calibri" w:hAnsi="Calibri"/>
+                <w:b w:val="0"/>
+                <w:i w:val="0"/>
+                <w:color w:val="FFFFFF"/>
+                <w:sz w:val="18"/>
+              </w:rPr>
+              <w:t>TFC- _______________</w:t>
+            </w:r>
+          </w:p>
+          <w:p>
+            <w:pPr>
+              <w:tabs>
+                <w:tab w:pos="3672" w:val="right"/>
+              </w:tabs>
+              <w:spacing w:before="40" w:after="0" w:line="240" w:lineRule="auto"/>
+            </w:pPr>
+            <w:r>
+              <w:rPr>
+                <w:rFonts w:ascii="Calibri" w:hAnsi="Calibri"/>
+                <w:b/>
+                <w:i w:val="0"/>
+                <w:color w:val="BAE6FD"/>
+                <w:sz w:val="13"/>
+                <w:caps w:val="true"/>
+                <w:spacing w:val="20"/>
+              </w:rPr>
+              <w:t xml:space="preserve">VALID THRU </w:t>
+            </w:r>
+            <w:r>
+              <w:rPr>
+                <w:rFonts w:ascii="Calibri" w:hAnsi="Calibri"/>
+                <w:b w:val="0"/>
+                <w:i w:val="0"/>
+                <w:color w:val="FFFFFF"/>
+                <w:sz w:val="16"/>
+              </w:rPr>
+              <w:t>____ / ______</w:t>
+            </w:r>
+            <w:r>
+              <w:rPr>
+                <w:rFonts w:ascii="Calibri" w:hAnsi="Calibri"/>
+                <w:b w:val="0"/>
+                <w:i w:val="0"/>
+                <w:color w:val="FFFFFF"/>
+                <w:sz w:val="16"/>
+              </w:rPr>
+              <w:tab/>
+            </w:r>
+            <w:r>
+              <w:rPr>
+                <w:rFonts w:ascii="Calibri" w:hAnsi="Calibri"/>
+                <w:b/>
+                <w:i w:val="0"/>
+                <w:color w:val="BAE6FD"/>
+                <w:sz w:val="13"/>
+                <w:caps w:val="true"/>
+                <w:spacing w:val="20"/>
+              </w:rPr>
+              <w:t xml:space="preserve">SIGN </w:t>
+            </w:r>
+            <w:r>
+              <w:rPr>
+                <w:rFonts w:ascii="Calibri" w:hAnsi="Calibri"/>
+                <w:b w:val="0"/>
+                <w:i w:val="0"/>
+                <w:color w:val="FFFFFF"/>
+                <w:sz w:val="16"/>
+              </w:rPr>
+              <w:t>____________</w:t>
+            </w:r>
+          </w:p>
         </w:tc>
       </w:tr>
     </w:tbl>
@@ -771,39 +284,20 @@
           <w:rFonts w:ascii="Calibri" w:hAnsi="Calibri"/>
           <w:b w:val="0"/>
           <w:i/>
-          <w:color w:val="0369A1"/>
+          <w:color w:val="475569"/>
           <w:sz w:val="17"/>
         </w:rPr>
-        <w:t>Replace the blank lines with each person's details and paste a photo into the box. The faded TFC logo sits behind the card as a watermark.</w:t>
+        <w:t>Printed at true card size (85.6 × 54 mm). The school logo sits behind the card as a watermark.</w:t>
       </w:r>
     </w:p>
     <w:sectPr>
-      <w:headerReference w:type="default" r:id="rId9"/>
       <w:pgSz w:w="12240" w:h="15840"/>
-      <w:pgMar w:top="1008" w:right="1296" w:bottom="1008" w:left="1296" w:header="720" w:footer="720" w:gutter="0"/>
+      <w:pgMar w:top="1440" w:right="1440" w:bottom="1440" w:left="1440" w:header="720" w:footer="720" w:gutter="0"/>
       <w:cols w:space="720"/>
       <w:docGrid w:linePitch="360"/>
     </w:sectPr>
   </w:body>
 </w:document>
-</file>
-
-<file path=word/header1.xml><?xml version="1.0" encoding="utf-8"?>
-<w:hdr xmlns:m="http://schemas.openxmlformats.org/officeDocument/2006/math" xmlns:mc="http://schemas.openxmlformats.org/markup-compatibility/2006" xmlns:mo="http://schemas.microsoft.com/office/mac/office/2008/main" xmlns:mv="urn:schemas-microsoft-com:mac:vml" xmlns:o="urn:schemas-microsoft-com:office:office" xmlns:r="http://schemas.openxmlformats.org/officeDocument/2006/relationships" xmlns:v="urn:schemas-microsoft-com:vml" xmlns:w10="urn:schemas-microsoft-com:office:word" xmlns:w14="http://schemas.microsoft.com/office/word/2010/wordml" xmlns:w="http://schemas.openxmlformats.org/wordprocessingml/2006/main" xmlns:wne="http://schemas.microsoft.com/office/word/2006/wordml" xmlns:wp14="http://schemas.microsoft.com/office/word/2010/wordprocessingDrawing" xmlns:wp="http://schemas.openxmlformats.org/drawingml/2006/wordprocessingDrawing" xmlns:wpc="http://schemas.microsoft.com/office/word/2010/wordprocessingCanvas" xmlns:wpg="http://schemas.microsoft.com/office/word/2010/wordprocessingGroup" xmlns:wpi="http://schemas.microsoft.com/office/word/2010/wordprocessingInk" xmlns:wps="http://schemas.microsoft.com/office/word/2010/wordprocessingShape" mc:Ignorable="w14 wp14">
-  <w:p>
-    <w:pPr>
-      <w:pStyle w:val="Header"/>
-      <w:jc w:val="center"/>
-    </w:pPr>
-    <w:r>
-      <w:pict>
-        <v:shape id="tfc_watermark" type="#_x0000_t75" style="position:absolute;margin-left:0;margin-top:0;width:300pt;height:300pt;z-index:-251658240;mso-position-horizontal:center;mso-position-horizontal-relative:margin;mso-position-vertical:center;mso-position-vertical-relative:margin">
-          <v:imagedata r:id="rId1" o:title="TFC"/>
-        </v:shape>
-      </w:pict>
-    </w:r>
-  </w:p>
-</w:hdr>
 </file>
 
 <file path=word/numbering.xml><?xml version="1.0" encoding="utf-8"?>

</xml_diff>

<commit_message>
Redesign ID card: white card with transparent logo watermark and blue field labels
</commit_message>
<xml_diff>
--- a/TFC-ID-Card-Template.docx
+++ b/TFC-ID-Card-Template.docx
@@ -8,35 +8,12 @@
       </w:pPr>
       <w:r>
         <w:rPr>
-          <w:rFonts w:ascii="Calibri" w:hAnsi="Calibri"/>
-          <w:b/>
-          <w:i w:val="0"/>
-          <w:color w:val="0B172A"/>
-          <w:sz w:val="26"/>
-          <w:spacing w:val="40"/>
-        </w:rPr>
-        <w:t>OFFICIAL ID CARD — TFC</w:t>
-      </w:r>
-    </w:p>
-    <w:p>
-      <w:pPr>
-        <w:jc w:val="center"/>
-      </w:pPr>
-      <w:r>
-        <w:rPr>
-          <w:rFonts w:ascii="Calibri" w:hAnsi="Calibri"/>
-          <w:b w:val="0"/>
           <w:i/>
-          <w:color w:val="475569"/>
+          <w:color w:val="8A97A5"/>
           <w:sz w:val="18"/>
         </w:rPr>
-        <w:t>standard card size · fill in the blanks</w:t>
+        <w:t>TFC — Official Identity Card  (print at 100%, 3.375" × 2.125")</w:t>
       </w:r>
-    </w:p>
-    <w:p>
-      <w:pPr>
-        <w:spacing w:after="80"/>
-      </w:pPr>
     </w:p>
     <w:tbl>
       <w:tblPr>
@@ -46,7 +23,7 @@
         <w:tblLook w:firstColumn="1" w:firstRow="1" w:lastColumn="0" w:lastRow="0" w:noHBand="0" w:noVBand="1" w:val="04A0"/>
       </w:tblPr>
       <w:tblGrid>
-        <w:gridCol w:w="9360"/>
+        <w:gridCol w:w="10080"/>
       </w:tblGrid>
       <w:tr>
         <w:trPr>
@@ -55,244 +32,237 @@
         <w:tc>
           <w:tcPr>
             <w:tcW w:type="dxa" w:w="4860"/>
-            <w:shd w:val="clear" w:color="auto" w:fill="0B172A"/>
-            <w:tcMar>
-              <w:top w:w="180" w:type="dxa"/>
-              <w:bottom w:w="120" w:type="dxa"/>
-              <w:start w:w="300" w:type="dxa"/>
-              <w:end w:w="240" w:type="dxa"/>
-            </w:tcMar>
+            <w:tcBorders>
+              <w:top w:val="nil"/>
+              <w:left w:val="nil"/>
+              <w:bottom w:val="nil"/>
+              <w:right w:val="nil"/>
+            </w:tcBorders>
           </w:tcPr>
           <w:p>
             <w:pPr>
-              <w:spacing w:before="0" w:after="0" w:line="240" w:lineRule="auto"/>
+              <w:spacing w:after="0" w:before="0"/>
             </w:pPr>
             <w:r>
-              <w:pict>
-                <v:shape id="tfc_card_bg" type="#_x0000_t75" style="position:absolute;left:0;top:0;width:243.0pt;height:153.0pt;z-index:-251658240;mso-position-horizontal:left;mso-position-vertical:top;mso-position-horizontal-relative:text;mso-position-vertical-relative:text" o:allowincell="t">
-                  <v:imagedata r:id="rId9" o:title="TFC"/>
-                </v:shape>
-              </w:pict>
+              <w:drawing>
+                <wp:anchor behindDoc="1" simplePos="0" locked="0" layoutInCell="1" allowOverlap="1" relativeHeight="0">
+                  <wp:simplePos x="0" y="0"/>
+                  <wp:positionH relativeFrom="column">
+                    <wp:posOffset>0</wp:posOffset>
+                  </wp:positionH>
+                  <wp:positionV relativeFrom="paragraph">
+                    <wp:posOffset>0</wp:posOffset>
+                  </wp:positionV>
+                  <wp:extent cx="3086100" cy="1943100"/>
+                  <wp:wrapNone/>
+                  <wp:docPr id="1" name="Picture 1"/>
+                  <wp:cNvGraphicFramePr xmlns:a="http://schemas.openxmlformats.org/drawingml/2006/main">
+                    <a:graphicFrameLocks noChangeAspect="1"/>
+                  </wp:cNvGraphicFramePr>
+                  <a:graphic xmlns:a="http://schemas.openxmlformats.org/drawingml/2006/main" xmlns:pic="http://schemas.openxmlformats.org/drawingml/2006/picture">
+                    <a:graphicData uri="http://schemas.openxmlformats.org/drawingml/2006/picture">
+                      <pic:pic>
+                        <pic:nvPicPr>
+                          <pic:cNvPr id="0" name="card_bg.png"/>
+                          <pic:cNvPicPr/>
+                        </pic:nvPicPr>
+                        <pic:blipFill>
+                          <a:blip r:embed="rId9"/>
+                          <a:stretch>
+                            <a:fillRect/>
+                          </a:stretch>
+                        </pic:blipFill>
+                        <pic:spPr>
+                          <a:xfrm>
+                            <a:off x="0" y="0"/>
+                            <a:ext cx="3086100" cy="1943100"/>
+                          </a:xfrm>
+                          <a:prstGeom prst="rect"/>
+                        </pic:spPr>
+                      </pic:pic>
+                    </a:graphicData>
+                  </a:graphic>
+                </wp:anchor>
+              </w:drawing>
             </w:r>
+          </w:p>
+          <w:p>
+            <w:pPr>
+              <w:spacing w:after="0"/>
+            </w:pPr>
             <w:r>
               <w:rPr>
-                <w:rFonts w:ascii="Calibri" w:hAnsi="Calibri"/>
+                <w:sz w:val="6"/>
+              </w:rPr>
+            </w:r>
+          </w:p>
+          <w:p>
+            <w:pPr>
+              <w:spacing w:after="0"/>
+              <w:jc w:val="center"/>
+            </w:pPr>
+            <w:r>
+              <w:rPr>
+                <w:rFonts w:ascii="Arial" w:hAnsi="Arial"/>
                 <w:b/>
-                <w:i w:val="0"/>
-                <w:color w:val="FFFFFF"/>
-                <w:sz w:val="21"/>
+                <w:color w:val="04436E"/>
+                <w:sz w:val="20"/>
               </w:rPr>
               <w:t>TRAINING FORMATION CENTER</w:t>
             </w:r>
           </w:p>
           <w:p>
             <w:pPr>
-              <w:spacing w:before="0" w:after="80" w:line="240" w:lineRule="auto"/>
+              <w:spacing w:after="120"/>
+              <w:jc w:val="center"/>
             </w:pPr>
             <w:r>
               <w:rPr>
-                <w:rFonts w:ascii="Calibri" w:hAnsi="Calibri"/>
-                <w:b w:val="0"/>
-                <w:i/>
-                <w:color w:val="7DD3FC"/>
-                <w:sz w:val="14"/>
-                <w:spacing w:val="20"/>
+                <w:rFonts w:ascii="Arial" w:hAnsi="Arial"/>
+                <w:color w:val="2E6EA8"/>
+                <w:sz w:val="13"/>
               </w:rPr>
-              <w:t>Student / Staff Identity Card</w:t>
+              <w:t>STUDENT IDENTITY CARD</w:t>
             </w:r>
           </w:p>
           <w:p>
             <w:pPr>
-              <w:spacing w:before="0" w:after="60" w:line="240" w:lineRule="auto"/>
+              <w:spacing w:after="40" w:before="0"/>
             </w:pPr>
             <w:r>
               <w:rPr>
-                <w:rFonts w:ascii="Calibri" w:hAnsi="Calibri"/>
+                <w:rFonts w:ascii="Arial" w:hAnsi="Arial"/>
                 <w:b/>
-                <w:i w:val="0"/>
-                <w:color w:val="BAE6FD"/>
-                <w:sz w:val="14"/>
-                <w:caps w:val="true"/>
-                <w:spacing w:val="20"/>
+                <w:color w:val="04436E"/>
+                <w:sz w:val="13"/>
               </w:rPr>
-              <w:t xml:space="preserve">Name  </w:t>
+              <w:t xml:space="preserve">NAME   </w:t>
             </w:r>
             <w:r>
               <w:rPr>
-                <w:rFonts w:ascii="Calibri" w:hAnsi="Calibri"/>
-                <w:b w:val="0"/>
-                <w:i w:val="0"/>
-                <w:color w:val="FFFFFF"/>
-                <w:sz w:val="20"/>
+                <w:rFonts w:ascii="Arial" w:hAnsi="Arial"/>
+                <w:color w:val="B6C2CE"/>
+                <w:sz w:val="16"/>
               </w:rPr>
-              <w:t>______________________________</w:t>
+              <w:t>______________________</w:t>
             </w:r>
           </w:p>
           <w:p>
             <w:pPr>
-              <w:spacing w:before="0" w:after="60" w:line="240" w:lineRule="auto"/>
+              <w:spacing w:after="40" w:before="0"/>
             </w:pPr>
             <w:r>
               <w:rPr>
-                <w:rFonts w:ascii="Calibri" w:hAnsi="Calibri"/>
+                <w:rFonts w:ascii="Arial" w:hAnsi="Arial"/>
                 <w:b/>
-                <w:i w:val="0"/>
-                <w:color w:val="BAE6FD"/>
-                <w:sz w:val="14"/>
-                <w:caps w:val="true"/>
-                <w:spacing w:val="20"/>
+                <w:color w:val="04436E"/>
+                <w:sz w:val="13"/>
               </w:rPr>
-              <w:t xml:space="preserve">Date of birth  </w:t>
+              <w:t xml:space="preserve">DATE OF BIRTH   </w:t>
             </w:r>
             <w:r>
               <w:rPr>
-                <w:rFonts w:ascii="Calibri" w:hAnsi="Calibri"/>
-                <w:b w:val="0"/>
-                <w:i w:val="0"/>
-                <w:color w:val="FFFFFF"/>
-                <w:sz w:val="18"/>
+                <w:rFonts w:ascii="Arial" w:hAnsi="Arial"/>
+                <w:color w:val="B6C2CE"/>
+                <w:sz w:val="16"/>
               </w:rPr>
-              <w:t>____ / ____ / __________</w:t>
+              <w:t>______________________</w:t>
             </w:r>
           </w:p>
           <w:p>
             <w:pPr>
-              <w:spacing w:before="0" w:after="60" w:line="240" w:lineRule="auto"/>
+              <w:spacing w:after="40" w:before="0"/>
             </w:pPr>
             <w:r>
               <w:rPr>
-                <w:rFonts w:ascii="Calibri" w:hAnsi="Calibri"/>
+                <w:rFonts w:ascii="Arial" w:hAnsi="Arial"/>
                 <w:b/>
-                <w:i w:val="0"/>
-                <w:color w:val="BAE6FD"/>
-                <w:sz w:val="14"/>
-                <w:caps w:val="true"/>
-                <w:spacing w:val="20"/>
+                <w:color w:val="04436E"/>
+                <w:sz w:val="13"/>
               </w:rPr>
-              <w:t xml:space="preserve">Course / Subject  </w:t>
+              <w:t xml:space="preserve">COURSE   </w:t>
             </w:r>
             <w:r>
               <w:rPr>
-                <w:rFonts w:ascii="Calibri" w:hAnsi="Calibri"/>
-                <w:b w:val="0"/>
-                <w:i w:val="0"/>
-                <w:color w:val="FFFFFF"/>
-                <w:sz w:val="18"/>
+                <w:rFonts w:ascii="Arial" w:hAnsi="Arial"/>
+                <w:color w:val="B6C2CE"/>
+                <w:sz w:val="16"/>
               </w:rPr>
-              <w:t>______________________________</w:t>
+              <w:t>______________________</w:t>
             </w:r>
           </w:p>
           <w:p>
             <w:pPr>
-              <w:spacing w:before="0" w:after="60" w:line="240" w:lineRule="auto"/>
+              <w:spacing w:after="40" w:before="0"/>
             </w:pPr>
             <w:r>
               <w:rPr>
-                <w:rFonts w:ascii="Calibri" w:hAnsi="Calibri"/>
+                <w:rFonts w:ascii="Arial" w:hAnsi="Arial"/>
                 <w:b/>
-                <w:i w:val="0"/>
-                <w:color w:val="BAE6FD"/>
-                <w:sz w:val="14"/>
-                <w:caps w:val="true"/>
-                <w:spacing w:val="20"/>
+                <w:color w:val="04436E"/>
+                <w:sz w:val="13"/>
               </w:rPr>
-              <w:t xml:space="preserve">Card ID  </w:t>
+              <w:t xml:space="preserve">CARD ID   </w:t>
             </w:r>
             <w:r>
               <w:rPr>
-                <w:rFonts w:ascii="Calibri" w:hAnsi="Calibri"/>
-                <w:b w:val="0"/>
-                <w:i w:val="0"/>
-                <w:color w:val="FFFFFF"/>
-                <w:sz w:val="18"/>
+                <w:rFonts w:ascii="Arial" w:hAnsi="Arial"/>
+                <w:color w:val="B6C2CE"/>
+                <w:sz w:val="16"/>
               </w:rPr>
-              <w:t>TFC- _______________</w:t>
+              <w:t>______________________</w:t>
             </w:r>
           </w:p>
           <w:p>
             <w:pPr>
-              <w:tabs>
-                <w:tab w:pos="3672" w:val="right"/>
-              </w:tabs>
-              <w:spacing w:before="40" w:after="0" w:line="240" w:lineRule="auto"/>
+              <w:spacing w:after="40" w:before="0"/>
             </w:pPr>
             <w:r>
               <w:rPr>
-                <w:rFonts w:ascii="Calibri" w:hAnsi="Calibri"/>
+                <w:rFonts w:ascii="Arial" w:hAnsi="Arial"/>
                 <w:b/>
-                <w:i w:val="0"/>
-                <w:color w:val="BAE6FD"/>
+                <w:color w:val="04436E"/>
                 <w:sz w:val="13"/>
-                <w:caps w:val="true"/>
-                <w:spacing w:val="20"/>
               </w:rPr>
-              <w:t xml:space="preserve">VALID THRU </w:t>
+              <w:t xml:space="preserve">VALID THRU   </w:t>
             </w:r>
             <w:r>
               <w:rPr>
-                <w:rFonts w:ascii="Calibri" w:hAnsi="Calibri"/>
-                <w:b w:val="0"/>
-                <w:i w:val="0"/>
-                <w:color w:val="FFFFFF"/>
+                <w:rFonts w:ascii="Arial" w:hAnsi="Arial"/>
+                <w:color w:val="B6C2CE"/>
                 <w:sz w:val="16"/>
               </w:rPr>
-              <w:t>____ / ______</w:t>
+              <w:t>______________________</w:t>
+            </w:r>
+          </w:p>
+          <w:p>
+            <w:pPr>
+              <w:spacing w:after="40" w:before="0"/>
+            </w:pPr>
+            <w:r>
+              <w:rPr>
+                <w:rFonts w:ascii="Arial" w:hAnsi="Arial"/>
+                <w:b/>
+                <w:color w:val="04436E"/>
+                <w:sz w:val="13"/>
+              </w:rPr>
+              <w:t xml:space="preserve">SIGNATURE   </w:t>
             </w:r>
             <w:r>
               <w:rPr>
-                <w:rFonts w:ascii="Calibri" w:hAnsi="Calibri"/>
-                <w:b w:val="0"/>
-                <w:i w:val="0"/>
-                <w:color w:val="FFFFFF"/>
+                <w:rFonts w:ascii="Arial" w:hAnsi="Arial"/>
+                <w:color w:val="B6C2CE"/>
                 <w:sz w:val="16"/>
               </w:rPr>
-              <w:tab/>
-            </w:r>
-            <w:r>
-              <w:rPr>
-                <w:rFonts w:ascii="Calibri" w:hAnsi="Calibri"/>
-                <w:b/>
-                <w:i w:val="0"/>
-                <w:color w:val="BAE6FD"/>
-                <w:sz w:val="13"/>
-                <w:caps w:val="true"/>
-                <w:spacing w:val="20"/>
-              </w:rPr>
-              <w:t xml:space="preserve">SIGN </w:t>
-            </w:r>
-            <w:r>
-              <w:rPr>
-                <w:rFonts w:ascii="Calibri" w:hAnsi="Calibri"/>
-                <w:b w:val="0"/>
-                <w:i w:val="0"/>
-                <w:color w:val="FFFFFF"/>
-                <w:sz w:val="16"/>
-              </w:rPr>
-              <w:t>____________</w:t>
+              <w:t>______________________</w:t>
             </w:r>
           </w:p>
         </w:tc>
       </w:tr>
     </w:tbl>
-    <w:p/>
-    <w:p>
-      <w:pPr>
-        <w:jc w:val="center"/>
-      </w:pPr>
-      <w:r>
-        <w:rPr>
-          <w:rFonts w:ascii="Calibri" w:hAnsi="Calibri"/>
-          <w:b w:val="0"/>
-          <w:i/>
-          <w:color w:val="475569"/>
-          <w:sz w:val="17"/>
-        </w:rPr>
-        <w:t>Printed at true card size (85.6 × 54 mm). The school logo sits behind the card as a watermark.</w:t>
-      </w:r>
-    </w:p>
     <w:sectPr>
       <w:pgSz w:w="12240" w:h="15840"/>
-      <w:pgMar w:top="1440" w:right="1440" w:bottom="1440" w:left="1440" w:header="720" w:footer="720" w:gutter="0"/>
+      <w:pgMar w:top="864" w:right="1080" w:bottom="864" w:left="1080" w:header="720" w:footer="720" w:gutter="0"/>
       <w:cols w:space="720"/>
       <w:docGrid w:linePitch="360"/>
     </w:sectPr>

</xml_diff>